<commit_message>
Version 6.2.3 reports updated
</commit_message>
<xml_diff>
--- a/docs/training/Sidwell_Cadastre_Tools_User_Training_and_Test_Guide.docx
+++ b/docs/training/Sidwell_Cadastre_Tools_User_Training_and_Test_Guide.docx
@@ -7,15 +7,7 @@
         <w:pStyle w:val="Title"/>
       </w:pPr>
       <w:r>
-        <w:t xml:space="preserve">Sidwell </w:t>
-      </w:r>
-      <w:proofErr w:type="spellStart"/>
-      <w:r>
-        <w:t>Cadastre</w:t>
-      </w:r>
-      <w:proofErr w:type="spellEnd"/>
-      <w:r>
-        <w:t xml:space="preserve"> Tools</w:t>
+        <w:t>Sidwell Cadastre Tools</w:t>
       </w:r>
     </w:p>
     <w:p>
@@ -75,6 +67,13 @@
     </w:p>
     <w:sdt>
       <w:sdtPr>
+        <w:rPr>
+          <w:rFonts w:ascii="Aptos" w:eastAsiaTheme="minorEastAsia" w:hAnsi="Aptos" w:cstheme="minorBidi"/>
+          <w:color w:val="auto"/>
+          <w:kern w:val="2"/>
+          <w:sz w:val="22"/>
+          <w:szCs w:val="22"/>
+        </w:rPr>
         <w:id w:val="1573086228"/>
         <w:docPartObj>
           <w:docPartGallery w:val="Table of Contents"/>
@@ -83,14 +82,9 @@
       </w:sdtPr>
       <w:sdtEndPr>
         <w:rPr>
-          <w:rFonts w:ascii="Aptos" w:eastAsiaTheme="minorEastAsia" w:hAnsi="Aptos" w:cstheme="minorBidi"/>
           <w:b/>
           <w:bCs/>
           <w:noProof/>
-          <w:color w:val="auto"/>
-          <w:kern w:val="2"/>
-          <w:sz w:val="22"/>
-          <w:szCs w:val="22"/>
         </w:rPr>
       </w:sdtEndPr>
       <w:sdtContent>
@@ -3008,23 +3002,7 @@
     <w:p/>
     <w:p>
       <w:r>
-        <w:t xml:space="preserve">This guide explains how to use the Sidwell </w:t>
-      </w:r>
-      <w:proofErr w:type="spellStart"/>
-      <w:r>
-        <w:t>Cadastre</w:t>
-      </w:r>
-      <w:proofErr w:type="spellEnd"/>
-      <w:r>
-        <w:t xml:space="preserve"> Tools Parcel Workflow Extension inside ArcGIS Pro to complete plan examination work that begins in the </w:t>
-      </w:r>
-      <w:proofErr w:type="spellStart"/>
-      <w:r>
-        <w:t>Innola</w:t>
-      </w:r>
-      <w:proofErr w:type="spellEnd"/>
-      <w:r>
-        <w:t xml:space="preserve"> framework.</w:t>
+        <w:t>This guide explains how to use the Sidwell Cadastre Tools Parcel Workflow Extension inside ArcGIS Pro to complete plan examination work that begins in the Innola framework.</w:t>
       </w:r>
     </w:p>
     <w:p/>
@@ -3037,6 +3015,10 @@
     <w:p>
       <w:pPr>
         <w:pStyle w:val="ListParagraph"/>
+        <w:numPr>
+          <w:ilvl w:val="0"/>
+          <w:numId w:val="1"/>
+        </w:numPr>
       </w:pPr>
       <w:r>
         <w:t>Train users on the end-to-end Compute and Compare workflow.</w:t>
@@ -3045,22 +3027,22 @@
     <w:p>
       <w:pPr>
         <w:pStyle w:val="ListParagraph"/>
-      </w:pPr>
-      <w:r>
-        <w:t xml:space="preserve">Run a repeatable test using assigned </w:t>
-      </w:r>
-      <w:proofErr w:type="spellStart"/>
-      <w:r>
-        <w:t>Innola</w:t>
-      </w:r>
-      <w:proofErr w:type="spellEnd"/>
-      <w:r>
-        <w:t xml:space="preserve"> transactions.</w:t>
-      </w:r>
-    </w:p>
-    <w:p>
-      <w:pPr>
-        <w:pStyle w:val="ListParagraph"/>
+        <w:numPr>
+          <w:ilvl w:val="0"/>
+          <w:numId w:val="1"/>
+        </w:numPr>
+      </w:pPr>
+      <w:r>
+        <w:t>Run a repeatable test using assigned Innola transactions.</w:t>
+      </w:r>
+    </w:p>
+    <w:p>
+      <w:pPr>
+        <w:pStyle w:val="ListParagraph"/>
+        <w:numPr>
+          <w:ilvl w:val="0"/>
+          <w:numId w:val="1"/>
+        </w:numPr>
       </w:pPr>
       <w:r>
         <w:t>Capture pass/fail evidence during user acceptance testing.</w:t>
@@ -3069,25 +3051,13 @@
     <w:p>
       <w:pPr>
         <w:pStyle w:val="ListParagraph"/>
-      </w:pPr>
-      <w:r>
-        <w:t xml:space="preserve">Troubleshoot common login, document, map, Python, </w:t>
-      </w:r>
-      <w:proofErr w:type="spellStart"/>
-      <w:r>
-        <w:t>ArcPy</w:t>
-      </w:r>
-      <w:proofErr w:type="spellEnd"/>
-      <w:r>
-        <w:t xml:space="preserve">, </w:t>
-      </w:r>
-      <w:proofErr w:type="spellStart"/>
-      <w:r>
-        <w:t>georeference</w:t>
-      </w:r>
-      <w:proofErr w:type="spellEnd"/>
-      <w:r>
-        <w:t>, and transaction-completion issues.</w:t>
+        <w:numPr>
+          <w:ilvl w:val="0"/>
+          <w:numId w:val="1"/>
+        </w:numPr>
+      </w:pPr>
+      <w:r>
+        <w:t>Troubleshoot common login, document, map, Python, ArcPy, georeference, and transaction-completion issues.</w:t>
       </w:r>
     </w:p>
     <w:p/>
@@ -3110,15 +3080,7 @@
     <w:p/>
     <w:p>
       <w:r>
-        <w:t xml:space="preserve">The transaction starts in </w:t>
-      </w:r>
-      <w:proofErr w:type="spellStart"/>
-      <w:r>
-        <w:t>Innola</w:t>
-      </w:r>
-      <w:proofErr w:type="spellEnd"/>
-      <w:r>
-        <w:t>. After the transaction is assigned to an SMD user, the user completes the work in ArcGIS Pro using this extension.</w:t>
+        <w:t>The transaction starts in Innola. After the transaction is assigned to an SMD user, the user completes the work in ArcGIS Pro using this extension.</w:t>
       </w:r>
     </w:p>
     <w:p/>
@@ -3131,46 +3093,34 @@
     <w:p>
       <w:pPr>
         <w:pStyle w:val="ListParagraph"/>
-      </w:pPr>
-      <w:r>
-        <w:t xml:space="preserve">The transaction is created and assigned </w:t>
-      </w:r>
-      <w:proofErr w:type="gramStart"/>
-      <w:r>
-        <w:t>in</w:t>
-      </w:r>
-      <w:proofErr w:type="gramEnd"/>
-      <w:r>
-        <w:t xml:space="preserve"> </w:t>
-      </w:r>
-      <w:proofErr w:type="spellStart"/>
-      <w:r>
-        <w:t>Innola</w:t>
-      </w:r>
-      <w:proofErr w:type="spellEnd"/>
-      <w:r>
-        <w:t>.</w:t>
-      </w:r>
-    </w:p>
-    <w:p>
-      <w:pPr>
-        <w:pStyle w:val="ListParagraph"/>
-      </w:pPr>
-      <w:r>
-        <w:t xml:space="preserve">The user opens ArcGIS Pro and logs into the </w:t>
-      </w:r>
-      <w:proofErr w:type="spellStart"/>
-      <w:r>
-        <w:t>Cadastre</w:t>
-      </w:r>
-      <w:proofErr w:type="spellEnd"/>
-      <w:r>
-        <w:t xml:space="preserve"> tools add-in.</w:t>
-      </w:r>
-    </w:p>
-    <w:p>
-      <w:pPr>
-        <w:pStyle w:val="ListParagraph"/>
+        <w:numPr>
+          <w:ilvl w:val="0"/>
+          <w:numId w:val="2"/>
+        </w:numPr>
+      </w:pPr>
+      <w:r>
+        <w:t>The transaction is created and assigned in Innola.</w:t>
+      </w:r>
+    </w:p>
+    <w:p>
+      <w:pPr>
+        <w:pStyle w:val="ListParagraph"/>
+        <w:numPr>
+          <w:ilvl w:val="0"/>
+          <w:numId w:val="2"/>
+        </w:numPr>
+      </w:pPr>
+      <w:r>
+        <w:t>The user opens ArcGIS Pro and logs into the Cadastre tools add-in.</w:t>
+      </w:r>
+    </w:p>
+    <w:p>
+      <w:pPr>
+        <w:pStyle w:val="ListParagraph"/>
+        <w:numPr>
+          <w:ilvl w:val="0"/>
+          <w:numId w:val="2"/>
+        </w:numPr>
       </w:pPr>
       <w:r>
         <w:t>The user refreshes the Transactions List and selects the assigned transaction.</w:t>
@@ -3179,6 +3129,10 @@
     <w:p>
       <w:pPr>
         <w:pStyle w:val="ListParagraph"/>
+        <w:numPr>
+          <w:ilvl w:val="0"/>
+          <w:numId w:val="2"/>
+        </w:numPr>
       </w:pPr>
       <w:r>
         <w:t>For Compute Survey Plan work, the user completes all Compute stages.</w:t>
@@ -3187,6 +3141,10 @@
     <w:p>
       <w:pPr>
         <w:pStyle w:val="ListParagraph"/>
+        <w:numPr>
+          <w:ilvl w:val="0"/>
+          <w:numId w:val="2"/>
+        </w:numPr>
       </w:pPr>
       <w:r>
         <w:t>The user reviews supporting documents and, when needed, runs M-Geo to overlay the survey plan on the map.</w:t>
@@ -3195,6 +3153,10 @@
     <w:p>
       <w:pPr>
         <w:pStyle w:val="ListParagraph"/>
+        <w:numPr>
+          <w:ilvl w:val="0"/>
+          <w:numId w:val="2"/>
+        </w:numPr>
       </w:pPr>
       <w:r>
         <w:t>The user validates points and lines, creates spatial units, and completes final review.</w:t>
@@ -3203,6 +3165,10 @@
     <w:p>
       <w:pPr>
         <w:pStyle w:val="ListParagraph"/>
+        <w:numPr>
+          <w:ilvl w:val="0"/>
+          <w:numId w:val="2"/>
+        </w:numPr>
       </w:pPr>
       <w:r>
         <w:t>For Compare Survey Plan work, the user launches Compare and reviews parcel evidence.</w:t>
@@ -3211,6 +3177,10 @@
     <w:p>
       <w:pPr>
         <w:pStyle w:val="ListParagraph"/>
+        <w:numPr>
+          <w:ilvl w:val="0"/>
+          <w:numId w:val="2"/>
+        </w:numPr>
       </w:pPr>
       <w:r>
         <w:t>The user saves, suspends, finalizes, or cancels according to the state of the work.</w:t>
@@ -3219,55 +3189,142 @@
     <w:p>
       <w:pPr>
         <w:pStyle w:val="ListParagraph"/>
+        <w:numPr>
+          <w:ilvl w:val="0"/>
+          <w:numId w:val="2"/>
+        </w:numPr>
       </w:pPr>
       <w:r>
         <w:lastRenderedPageBreak/>
-        <w:t xml:space="preserve">When finalized, the transaction is moved forward in the </w:t>
-      </w:r>
-      <w:proofErr w:type="spellStart"/>
-      <w:r>
-        <w:t>Innola</w:t>
-      </w:r>
-      <w:proofErr w:type="spellEnd"/>
-      <w:r>
-        <w:t xml:space="preserve"> workflow.</w:t>
-      </w:r>
-    </w:p>
-    <w:p/>
+        <w:t>When finalized, the transaction is moved forward in the Innola workflow.</w:t>
+      </w:r>
+    </w:p>
+    <w:p>
+      <w:pPr>
+        <w:jc w:val="center"/>
+      </w:pPr>
+      <w:r>
+        <w:rPr>
+          <w:noProof/>
+        </w:rPr>
+        <w:drawing>
+          <wp:inline distT="0" distB="0" distL="0" distR="0" wp14:anchorId="52046CC8" wp14:editId="588FEC00">
+            <wp:extent cx="6858000" cy="3214370"/>
+            <wp:effectExtent l="0" t="0" r="0" b="0"/>
+            <wp:docPr id="1764888900" name="Picture 1"/>
+            <wp:cNvGraphicFramePr>
+              <a:graphicFrameLocks xmlns:a="http://schemas.openxmlformats.org/drawingml/2006/main" noChangeAspect="1"/>
+            </wp:cNvGraphicFramePr>
+            <a:graphic xmlns:a="http://schemas.openxmlformats.org/drawingml/2006/main">
+              <a:graphicData uri="http://schemas.openxmlformats.org/drawingml/2006/picture">
+                <pic:pic xmlns:pic="http://schemas.openxmlformats.org/drawingml/2006/picture">
+                  <pic:nvPicPr>
+                    <pic:cNvPr id="1764888900" name="Picture 1764888900"/>
+                    <pic:cNvPicPr/>
+                  </pic:nvPicPr>
+                  <pic:blipFill>
+                    <a:blip r:embed="rId6" cstate="print">
+                      <a:extLst>
+                        <a:ext uri="{28A0092B-C50C-407E-A947-70E740481C1C}">
+                          <a14:useLocalDpi xmlns:a14="http://schemas.microsoft.com/office/drawing/2010/main" val="0"/>
+                        </a:ext>
+                      </a:extLst>
+                    </a:blip>
+                    <a:stretch>
+                      <a:fillRect/>
+                    </a:stretch>
+                  </pic:blipFill>
+                  <pic:spPr>
+                    <a:xfrm>
+                      <a:off x="0" y="0"/>
+                      <a:ext cx="6858000" cy="3214370"/>
+                    </a:xfrm>
+                    <a:prstGeom prst="rect">
+                      <a:avLst/>
+                    </a:prstGeom>
+                  </pic:spPr>
+                </pic:pic>
+              </a:graphicData>
+            </a:graphic>
+          </wp:inline>
+        </w:drawing>
+      </w:r>
+    </w:p>
     <w:p>
       <w:pPr>
         <w:pStyle w:val="ScreenshotPlaceholder"/>
-      </w:pPr>
-      <w:r>
-        <w:t xml:space="preserve">[Screenshot placeholder: </w:t>
-      </w:r>
-      <w:r>
+        <w:jc w:val="center"/>
+      </w:pPr>
+      <w:r>
+        <w:t>Lodgment workflow</w:t>
+      </w:r>
+    </w:p>
+    <w:p>
+      <w:pPr>
+        <w:pStyle w:val="ScreenshotPlaceholder"/>
         <w:rPr>
-          <w:rStyle w:val="CodeChar"/>
+          <w:i w:val="0"/>
+          <w:iCs/>
         </w:rPr>
-        <w:t>00-workflow-overview.png</w:t>
-      </w:r>
-      <w:r>
-        <w:t xml:space="preserve"> - overall process diagram from </w:t>
-      </w:r>
-      <w:proofErr w:type="spellStart"/>
-      <w:r>
-        <w:t>Innola</w:t>
-      </w:r>
-      <w:proofErr w:type="spellEnd"/>
-      <w:r>
-        <w:t xml:space="preserve"> to ArcGIS Pro and back to </w:t>
-      </w:r>
-      <w:proofErr w:type="spellStart"/>
-      <w:r>
-        <w:t>Innola</w:t>
-      </w:r>
-      <w:proofErr w:type="spellEnd"/>
-      <w:r>
-        <w:t>.]</w:t>
-      </w:r>
-    </w:p>
-    <w:p/>
+      </w:pPr>
+      <w:r>
+        <w:rPr>
+          <w:i w:val="0"/>
+          <w:iCs/>
+          <w:noProof/>
+        </w:rPr>
+        <w:drawing>
+          <wp:inline distT="0" distB="0" distL="0" distR="0" wp14:anchorId="686A8291" wp14:editId="7143FEB9">
+            <wp:extent cx="6858000" cy="3607435"/>
+            <wp:effectExtent l="0" t="0" r="0" b="0"/>
+            <wp:docPr id="239800106" name="Picture 2"/>
+            <wp:cNvGraphicFramePr>
+              <a:graphicFrameLocks xmlns:a="http://schemas.openxmlformats.org/drawingml/2006/main" noChangeAspect="1"/>
+            </wp:cNvGraphicFramePr>
+            <a:graphic xmlns:a="http://schemas.openxmlformats.org/drawingml/2006/main">
+              <a:graphicData uri="http://schemas.openxmlformats.org/drawingml/2006/picture">
+                <pic:pic xmlns:pic="http://schemas.openxmlformats.org/drawingml/2006/picture">
+                  <pic:nvPicPr>
+                    <pic:cNvPr id="239800106" name="Picture 239800106"/>
+                    <pic:cNvPicPr/>
+                  </pic:nvPicPr>
+                  <pic:blipFill>
+                    <a:blip r:embed="rId7" cstate="print">
+                      <a:extLst>
+                        <a:ext uri="{28A0092B-C50C-407E-A947-70E740481C1C}">
+                          <a14:useLocalDpi xmlns:a14="http://schemas.microsoft.com/office/drawing/2010/main" val="0"/>
+                        </a:ext>
+                      </a:extLst>
+                    </a:blip>
+                    <a:stretch>
+                      <a:fillRect/>
+                    </a:stretch>
+                  </pic:blipFill>
+                  <pic:spPr>
+                    <a:xfrm>
+                      <a:off x="0" y="0"/>
+                      <a:ext cx="6858000" cy="3607435"/>
+                    </a:xfrm>
+                    <a:prstGeom prst="rect">
+                      <a:avLst/>
+                    </a:prstGeom>
+                  </pic:spPr>
+                </pic:pic>
+              </a:graphicData>
+            </a:graphic>
+          </wp:inline>
+        </w:drawing>
+      </w:r>
+    </w:p>
+    <w:p>
+      <w:pPr>
+        <w:pStyle w:val="ScreenshotPlaceholder"/>
+        <w:jc w:val="center"/>
+      </w:pPr>
+      <w:r>
+        <w:t>Plan examination Workflow</w:t>
+      </w:r>
+    </w:p>
     <w:p>
       <w:pPr>
         <w:pStyle w:val="Heading1"/>
@@ -3290,6 +3347,7 @@
         <w:pStyle w:val="ListParagraph"/>
       </w:pPr>
       <w:r>
+        <w:lastRenderedPageBreak/>
         <w:t>ArcGIS Pro is installed and licensed.</w:t>
       </w:r>
     </w:p>
@@ -3298,31 +3356,15 @@
         <w:pStyle w:val="ListParagraph"/>
       </w:pPr>
       <w:r>
-        <w:t xml:space="preserve">The Sidwell </w:t>
-      </w:r>
-      <w:proofErr w:type="spellStart"/>
-      <w:r>
-        <w:t>Cadastre</w:t>
-      </w:r>
-      <w:proofErr w:type="spellEnd"/>
-      <w:r>
-        <w:t xml:space="preserve"> Tools add-in is installed and visible in ArcGIS Pro.</w:t>
-      </w:r>
-    </w:p>
-    <w:p>
-      <w:pPr>
-        <w:pStyle w:val="ListParagraph"/>
-      </w:pPr>
-      <w:r>
-        <w:t xml:space="preserve">The user has </w:t>
-      </w:r>
-      <w:proofErr w:type="spellStart"/>
-      <w:r>
-        <w:t>Innola</w:t>
-      </w:r>
-      <w:proofErr w:type="spellEnd"/>
-      <w:r>
-        <w:t xml:space="preserve"> credentials.</w:t>
+        <w:t>The Sidwell Cadastre Tools add-in is installed and visible in ArcGIS Pro.</w:t>
+      </w:r>
+    </w:p>
+    <w:p>
+      <w:pPr>
+        <w:pStyle w:val="ListParagraph"/>
+      </w:pPr>
+      <w:r>
+        <w:t>The user has Innola credentials.</w:t>
       </w:r>
     </w:p>
     <w:p>
@@ -3338,15 +3380,7 @@
         <w:pStyle w:val="ListParagraph"/>
       </w:pPr>
       <w:r>
-        <w:t xml:space="preserve">The computer has access to the configured </w:t>
-      </w:r>
-      <w:proofErr w:type="spellStart"/>
-      <w:r>
-        <w:t>Innola</w:t>
-      </w:r>
-      <w:proofErr w:type="spellEnd"/>
-      <w:r>
-        <w:t xml:space="preserve"> server.</w:t>
+        <w:t>The computer has access to the configured Innola server.</w:t>
       </w:r>
     </w:p>
     <w:p>
@@ -3385,13 +3419,8 @@
       <w:pPr>
         <w:pStyle w:val="ListParagraph"/>
       </w:pPr>
-      <w:proofErr w:type="spellStart"/>
-      <w:r>
-        <w:t>ArcPy</w:t>
-      </w:r>
-      <w:proofErr w:type="spellEnd"/>
-      <w:r>
-        <w:t xml:space="preserve"> is available when geoprocessing or output generation requires it.</w:t>
+      <w:r>
+        <w:t>ArcPy is available when geoprocessing or output generation requires it.</w:t>
       </w:r>
     </w:p>
     <w:p>
@@ -3404,13 +3433,8 @@
     </w:p>
     <w:p/>
     <w:p>
-      <w:proofErr w:type="gramStart"/>
-      <w:r>
-        <w:t>Typical</w:t>
-      </w:r>
-      <w:proofErr w:type="gramEnd"/>
-      <w:r>
-        <w:t xml:space="preserve"> installed paths:</w:t>
+      <w:r>
+        <w:t>Typical installed paths:</w:t>
       </w:r>
     </w:p>
     <w:p/>
@@ -3446,13 +3470,8 @@
       <w:pPr>
         <w:pStyle w:val="ListParagraph"/>
       </w:pPr>
-      <w:proofErr w:type="spellStart"/>
-      <w:r>
-        <w:t>ProgramData</w:t>
-      </w:r>
-      <w:proofErr w:type="spellEnd"/>
-      <w:r>
-        <w:t xml:space="preserve"> logs: </w:t>
+      <w:r>
+        <w:t xml:space="preserve">ProgramData logs: </w:t>
       </w:r>
       <w:r>
         <w:rPr>
@@ -3505,19 +3524,11 @@
       <w:r>
         <w:t xml:space="preserve">Open ArcGIS Pro and select the </w:t>
       </w:r>
-      <w:proofErr w:type="spellStart"/>
       <w:r>
         <w:rPr>
           <w:rStyle w:val="CodeChar"/>
         </w:rPr>
-        <w:t>Cadastre</w:t>
-      </w:r>
-      <w:proofErr w:type="spellEnd"/>
-      <w:r>
-        <w:rPr>
-          <w:rStyle w:val="CodeChar"/>
-        </w:rPr>
-        <w:t xml:space="preserve"> tools</w:t>
+        <w:t>Cadastre tools</w:t>
       </w:r>
       <w:r>
         <w:t xml:space="preserve"> ribbon tab.</w:t>
@@ -3554,23 +3565,7 @@
         <w:pStyle w:val="ListParagraph"/>
       </w:pPr>
       <w:r>
-        <w:t xml:space="preserve">Enter the </w:t>
-      </w:r>
-      <w:proofErr w:type="spellStart"/>
-      <w:r>
-        <w:t>Innola</w:t>
-      </w:r>
-      <w:proofErr w:type="spellEnd"/>
-      <w:r>
-        <w:t xml:space="preserve"> </w:t>
-      </w:r>
-      <w:proofErr w:type="gramStart"/>
-      <w:r>
-        <w:t>user name</w:t>
-      </w:r>
-      <w:proofErr w:type="gramEnd"/>
-      <w:r>
-        <w:t xml:space="preserve"> and password.</w:t>
+        <w:t>Enter the Innola user name and password.</w:t>
       </w:r>
     </w:p>
     <w:p>
@@ -3601,6 +3596,7 @@
     <w:p/>
     <w:p>
       <w:r>
+        <w:lastRenderedPageBreak/>
         <w:t>The server value comes from configuration and is read-only. Users should not edit it during normal work.</w:t>
       </w:r>
     </w:p>
@@ -3642,15 +3638,7 @@
         <w:pStyle w:val="ListParagraph"/>
       </w:pPr>
       <w:r>
-        <w:t xml:space="preserve">The Transactions List panel shows the </w:t>
-      </w:r>
-      <w:proofErr w:type="gramStart"/>
-      <w:r>
-        <w:t>user name</w:t>
-      </w:r>
-      <w:proofErr w:type="gramEnd"/>
-      <w:r>
-        <w:t>.</w:t>
+        <w:t>The Transactions List panel shows the user name.</w:t>
       </w:r>
     </w:p>
     <w:p>
@@ -3673,15 +3661,7 @@
         <w:pStyle w:val="ListParagraph"/>
       </w:pPr>
       <w:r>
-        <w:t xml:space="preserve">Confirm the </w:t>
-      </w:r>
-      <w:proofErr w:type="gramStart"/>
-      <w:r>
-        <w:t>user name</w:t>
-      </w:r>
-      <w:proofErr w:type="gramEnd"/>
-      <w:r>
-        <w:t xml:space="preserve"> and password.</w:t>
+        <w:t>Confirm the user name and password.</w:t>
       </w:r>
     </w:p>
     <w:p>
@@ -3697,15 +3677,7 @@
         <w:pStyle w:val="ListParagraph"/>
       </w:pPr>
       <w:r>
-        <w:t xml:space="preserve">Confirm the computer can reach the </w:t>
-      </w:r>
-      <w:proofErr w:type="spellStart"/>
-      <w:r>
-        <w:t>Innola</w:t>
-      </w:r>
-      <w:proofErr w:type="spellEnd"/>
-      <w:r>
-        <w:t xml:space="preserve"> server.</w:t>
+        <w:t>Confirm the computer can reach the Innola server.</w:t>
       </w:r>
     </w:p>
     <w:p>
@@ -3736,110 +3708,73 @@
     <w:p/>
     <w:p>
       <w:r>
+        <w:t>Main controls:</w:t>
+      </w:r>
+    </w:p>
+    <w:p/>
+    <w:p>
+      <w:pPr>
+        <w:pStyle w:val="ListParagraph"/>
+      </w:pPr>
+      <w:r>
+        <w:t>Refresh: reloads available transactions from Innola.</w:t>
+      </w:r>
+    </w:p>
+    <w:p>
+      <w:pPr>
+        <w:pStyle w:val="ListParagraph"/>
+      </w:pPr>
+      <w:r>
+        <w:t>Filter: shows all available active tasks or tasks assigned to the logged-in user.</w:t>
+      </w:r>
+    </w:p>
+    <w:p>
+      <w:pPr>
+        <w:pStyle w:val="ListParagraph"/>
+      </w:pPr>
+      <w:r>
+        <w:t>Search: filters the visible list by transaction number or text.</w:t>
+      </w:r>
+    </w:p>
+    <w:p>
+      <w:pPr>
+        <w:pStyle w:val="ListParagraph"/>
+      </w:pPr>
+      <w:r>
+        <w:t>Sort: changes the list order.</w:t>
+      </w:r>
+    </w:p>
+    <w:p>
+      <w:pPr>
+        <w:pStyle w:val="ListParagraph"/>
+      </w:pPr>
+      <w:r>
+        <w:t>Transaction row: selects the transaction to work on.</w:t>
+      </w:r>
+    </w:p>
+    <w:p>
+      <w:pPr>
+        <w:pStyle w:val="ListParagraph"/>
+      </w:pPr>
+      <w:r>
+        <w:t>Transaction Info: shows key information about the selected transaction.</w:t>
+      </w:r>
+    </w:p>
+    <w:p>
+      <w:pPr>
+        <w:pStyle w:val="ListParagraph"/>
+      </w:pPr>
+      <w:r>
+        <w:t>SD: opens Supporting Documents for the loaded transaction.</w:t>
+      </w:r>
+    </w:p>
+    <w:p>
+      <w:pPr>
+        <w:pStyle w:val="ListParagraph"/>
+      </w:pPr>
+      <w:r>
         <w:lastRenderedPageBreak/>
-        <w:t>Main controls:</w:t>
-      </w:r>
-    </w:p>
-    <w:p/>
-    <w:p>
-      <w:pPr>
-        <w:pStyle w:val="ListParagraph"/>
-      </w:pPr>
-      <w:r>
-        <w:t xml:space="preserve">Refresh: reloads available transactions from </w:t>
-      </w:r>
-      <w:proofErr w:type="spellStart"/>
-      <w:r>
-        <w:t>Innola</w:t>
-      </w:r>
-      <w:proofErr w:type="spellEnd"/>
-      <w:r>
-        <w:t>.</w:t>
-      </w:r>
-    </w:p>
-    <w:p>
-      <w:pPr>
-        <w:pStyle w:val="ListParagraph"/>
-      </w:pPr>
-      <w:r>
-        <w:t>Filter: shows all available active tasks or tasks assigned to the logged-in user.</w:t>
-      </w:r>
-    </w:p>
-    <w:p>
-      <w:pPr>
-        <w:pStyle w:val="ListParagraph"/>
-      </w:pPr>
-      <w:r>
-        <w:t>Search: filters the visible list by transaction number or text.</w:t>
-      </w:r>
-    </w:p>
-    <w:p>
-      <w:pPr>
-        <w:pStyle w:val="ListParagraph"/>
-      </w:pPr>
-      <w:proofErr w:type="gramStart"/>
-      <w:r>
-        <w:t>Sort</w:t>
-      </w:r>
-      <w:proofErr w:type="gramEnd"/>
-      <w:r>
-        <w:t xml:space="preserve">: </w:t>
-      </w:r>
-      <w:proofErr w:type="gramStart"/>
-      <w:r>
-        <w:t>changes</w:t>
-      </w:r>
-      <w:proofErr w:type="gramEnd"/>
-      <w:r>
-        <w:t xml:space="preserve"> the list order.</w:t>
-      </w:r>
-    </w:p>
-    <w:p>
-      <w:pPr>
-        <w:pStyle w:val="ListParagraph"/>
-      </w:pPr>
-      <w:r>
-        <w:t>Transaction row: selects the transaction to work on.</w:t>
-      </w:r>
-    </w:p>
-    <w:p>
-      <w:pPr>
-        <w:pStyle w:val="ListParagraph"/>
-      </w:pPr>
-      <w:r>
-        <w:t>Transaction Info: shows key information about the selected transaction.</w:t>
-      </w:r>
-    </w:p>
-    <w:p>
-      <w:pPr>
-        <w:pStyle w:val="ListParagraph"/>
-      </w:pPr>
-      <w:r>
-        <w:t>SD: opens Supporting Documents for the loaded transaction.</w:t>
-      </w:r>
-    </w:p>
-    <w:p>
-      <w:pPr>
-        <w:pStyle w:val="ListParagraph"/>
-      </w:pPr>
-      <w:r>
-        <w:t>M-</w:t>
-      </w:r>
-      <w:proofErr w:type="gramStart"/>
-      <w:r>
-        <w:t>Geo:</w:t>
-      </w:r>
-      <w:proofErr w:type="gramEnd"/>
-      <w:r>
-        <w:t xml:space="preserve"> opens the map </w:t>
-      </w:r>
-      <w:proofErr w:type="spellStart"/>
-      <w:r>
-        <w:t>georeference</w:t>
-      </w:r>
-      <w:proofErr w:type="spellEnd"/>
-      <w:r>
-        <w:t xml:space="preserve"> review workflow for the loaded transaction.</w:t>
+        <w:t>M-Geo: opens the map georeference review workflow for the loaded transaction.</w:t>
       </w:r>
     </w:p>
     <w:p>
@@ -3947,46 +3882,46 @@
         <w:pStyle w:val="ListParagraph"/>
       </w:pPr>
       <w:r>
+        <w:t>A selected transaction shows its transaction number and task type.</w:t>
+      </w:r>
+    </w:p>
+    <w:p>
+      <w:pPr>
+        <w:pStyle w:val="ListParagraph"/>
+      </w:pPr>
+      <w:r>
+        <w:t>SD, M-Geo, and CMP are enabled only when valid for the loaded transaction.</w:t>
+      </w:r>
+    </w:p>
+    <w:p>
+      <w:pPr>
+        <w:pStyle w:val="ListParagraph"/>
+      </w:pPr>
+      <w:r>
+        <w:t>Cancel or Finalize clears the active transaction state and disables transaction-specific actions.</w:t>
+      </w:r>
+    </w:p>
+    <w:p/>
+    <w:p>
+      <w:pPr>
+        <w:pStyle w:val="Heading1"/>
+      </w:pPr>
+      <w:bookmarkStart w:id="5" w:name="_Toc236825245"/>
+      <w:r>
+        <w:t>6. Compute Workflow</w:t>
+      </w:r>
+      <w:bookmarkEnd w:id="5"/>
+    </w:p>
+    <w:p/>
+    <w:p>
+      <w:r>
+        <w:t>Use Compute for transactions that require survey plan processing, point and line validation, and spatial unit creation.</w:t>
+      </w:r>
+    </w:p>
+    <w:p/>
+    <w:p>
+      <w:r>
         <w:lastRenderedPageBreak/>
-        <w:t>A selected transaction shows its transaction number and task type.</w:t>
-      </w:r>
-    </w:p>
-    <w:p>
-      <w:pPr>
-        <w:pStyle w:val="ListParagraph"/>
-      </w:pPr>
-      <w:r>
-        <w:t>SD, M-Geo, and CMP are enabled only when valid for the loaded transaction.</w:t>
-      </w:r>
-    </w:p>
-    <w:p>
-      <w:pPr>
-        <w:pStyle w:val="ListParagraph"/>
-      </w:pPr>
-      <w:r>
-        <w:t>Cancel or Finalize clears the active transaction state and disables transaction-specific actions.</w:t>
-      </w:r>
-    </w:p>
-    <w:p/>
-    <w:p>
-      <w:pPr>
-        <w:pStyle w:val="Heading1"/>
-      </w:pPr>
-      <w:bookmarkStart w:id="5" w:name="_Toc236825245"/>
-      <w:r>
-        <w:t>6. Compute Workflow</w:t>
-      </w:r>
-      <w:bookmarkEnd w:id="5"/>
-    </w:p>
-    <w:p/>
-    <w:p>
-      <w:r>
-        <w:t>Use Compute for transactions that require survey plan processing, point and line validation, and spatial unit creation.</w:t>
-      </w:r>
-    </w:p>
-    <w:p/>
-    <w:p>
-      <w:r>
         <w:t>Typical Compute stages:</w:t>
       </w:r>
     </w:p>
@@ -4011,13 +3946,8 @@
       <w:pPr>
         <w:pStyle w:val="ListParagraph"/>
       </w:pPr>
-      <w:proofErr w:type="spellStart"/>
-      <w:r>
-        <w:t>Georeference</w:t>
-      </w:r>
-      <w:proofErr w:type="spellEnd"/>
-      <w:r>
-        <w:t xml:space="preserve"> Check</w:t>
+      <w:r>
+        <w:t>Georeference Check</w:t>
       </w:r>
     </w:p>
     <w:p>
@@ -4040,13 +3970,8 @@
       <w:pPr>
         <w:pStyle w:val="ListParagraph"/>
       </w:pPr>
-      <w:proofErr w:type="gramStart"/>
-      <w:r>
-        <w:t>Create</w:t>
-      </w:r>
-      <w:proofErr w:type="gramEnd"/>
-      <w:r>
-        <w:t xml:space="preserve"> Spatial Units</w:t>
+      <w:r>
+        <w:t>Create Spatial Units</w:t>
       </w:r>
     </w:p>
     <w:p>
@@ -4068,15 +3993,7 @@
     <w:p/>
     <w:p>
       <w:r>
-        <w:t xml:space="preserve">The workflow panel shows a status tile for each stage. A green tile means the stage completed. A warning or blocker means the user must review the </w:t>
-      </w:r>
-      <w:proofErr w:type="gramStart"/>
-      <w:r>
-        <w:t>detail</w:t>
-      </w:r>
-      <w:proofErr w:type="gramEnd"/>
-      <w:r>
-        <w:t xml:space="preserve"> before moving forward.</w:t>
+        <w:t>The workflow panel shows a status tile for each stage. A green tile means the stage completed. A warning or blocker means the user must review the detail before moving forward.</w:t>
       </w:r>
     </w:p>
     <w:p/>
@@ -4126,7 +4043,6 @@
         <w:pStyle w:val="ListParagraph"/>
       </w:pPr>
       <w:r>
-        <w:lastRenderedPageBreak/>
         <w:t>Required source files are copied.</w:t>
       </w:r>
     </w:p>
@@ -4192,15 +4108,7 @@
         <w:pStyle w:val="ListParagraph"/>
       </w:pPr>
       <w:r>
-        <w:t>If a blocker appears, the message explains the missing file, invalid file, or Python/</w:t>
-      </w:r>
-      <w:proofErr w:type="spellStart"/>
-      <w:r>
-        <w:t>ArcPy</w:t>
-      </w:r>
-      <w:proofErr w:type="spellEnd"/>
-      <w:r>
-        <w:t xml:space="preserve"> issue.</w:t>
+        <w:t>If a blocker appears, the message explains the missing file, invalid file, or Python/ArcPy issue.</w:t>
       </w:r>
     </w:p>
     <w:p/>
@@ -4209,13 +4117,8 @@
         <w:pStyle w:val="Heading2"/>
       </w:pPr>
       <w:bookmarkStart w:id="8" w:name="_Toc236825248"/>
-      <w:proofErr w:type="spellStart"/>
-      <w:r>
-        <w:t>Georeference</w:t>
-      </w:r>
-      <w:proofErr w:type="spellEnd"/>
-      <w:r>
-        <w:t xml:space="preserve"> Check</w:t>
+      <w:r>
+        <w:t>Georeference Check</w:t>
       </w:r>
       <w:bookmarkEnd w:id="8"/>
     </w:p>
@@ -4237,15 +4140,7 @@
         <w:pStyle w:val="ListParagraph"/>
       </w:pPr>
       <w:r>
-        <w:t xml:space="preserve">The tool detects JAD2001 coordinates, parish, location text, or other </w:t>
-      </w:r>
-      <w:proofErr w:type="spellStart"/>
-      <w:r>
-        <w:t>georeference</w:t>
-      </w:r>
-      <w:proofErr w:type="spellEnd"/>
-      <w:r>
-        <w:t xml:space="preserve"> evidence.</w:t>
+        <w:t>The tool detects JAD2001 coordinates, parish, location text, or other georeference evidence.</w:t>
       </w:r>
     </w:p>
     <w:p>
@@ -4301,47 +4196,47 @@
         <w:pStyle w:val="ListParagraph"/>
       </w:pPr>
       <w:r>
+        <w:t>Blockers must be corrected before moving forward.</w:t>
+      </w:r>
+    </w:p>
+    <w:p/>
+    <w:p>
+      <w:pPr>
+        <w:pStyle w:val="Heading1"/>
+      </w:pPr>
+      <w:bookmarkStart w:id="10" w:name="_Toc236825250"/>
+      <w:r>
+        <w:t>7. Supporting Documents</w:t>
+      </w:r>
+      <w:bookmarkEnd w:id="10"/>
+    </w:p>
+    <w:p/>
+    <w:p>
+      <w:r>
+        <w:t>Supporting Documents opens a transaction-scoped WPF window. It is used to view the copied source documents while the user works in Compute or Compare.</w:t>
+      </w:r>
+    </w:p>
+    <w:p/>
+    <w:p>
+      <w:r>
+        <w:t>Use it to:</w:t>
+      </w:r>
+    </w:p>
+    <w:p/>
+    <w:p>
+      <w:pPr>
+        <w:pStyle w:val="ListParagraph"/>
+      </w:pPr>
+      <w:r>
+        <w:t>Confirm the survey plan PDF.</w:t>
+      </w:r>
+    </w:p>
+    <w:p>
+      <w:pPr>
+        <w:pStyle w:val="ListParagraph"/>
+      </w:pPr>
+      <w:r>
         <w:lastRenderedPageBreak/>
-        <w:t>Blockers must be corrected before moving forward.</w:t>
-      </w:r>
-    </w:p>
-    <w:p/>
-    <w:p>
-      <w:pPr>
-        <w:pStyle w:val="Heading1"/>
-      </w:pPr>
-      <w:bookmarkStart w:id="10" w:name="_Toc236825250"/>
-      <w:r>
-        <w:t>7. Supporting Documents</w:t>
-      </w:r>
-      <w:bookmarkEnd w:id="10"/>
-    </w:p>
-    <w:p/>
-    <w:p>
-      <w:r>
-        <w:t>Supporting Documents opens a transaction-scoped WPF window. It is used to view the copied source documents while the user works in Compute or Compare.</w:t>
-      </w:r>
-    </w:p>
-    <w:p/>
-    <w:p>
-      <w:r>
-        <w:t>Use it to:</w:t>
-      </w:r>
-    </w:p>
-    <w:p/>
-    <w:p>
-      <w:pPr>
-        <w:pStyle w:val="ListParagraph"/>
-      </w:pPr>
-      <w:r>
-        <w:t>Confirm the survey plan PDF.</w:t>
-      </w:r>
-    </w:p>
-    <w:p>
-      <w:pPr>
-        <w:pStyle w:val="ListParagraph"/>
-      </w:pPr>
-      <w:r>
         <w:t>Review text or document attachments copied with the transaction.</w:t>
       </w:r>
     </w:p>
@@ -4444,16 +4339,8 @@
         <w:rPr>
           <w:rStyle w:val="CodeChar"/>
         </w:rPr>
-        <w:t>.</w:t>
-      </w:r>
-      <w:proofErr w:type="spellStart"/>
-      <w:r>
-        <w:rPr>
-          <w:rStyle w:val="CodeChar"/>
-        </w:rPr>
-        <w:t>rar</w:t>
-      </w:r>
-      <w:proofErr w:type="spellEnd"/>
+        <w:t>.rar</w:t>
+      </w:r>
     </w:p>
     <w:p>
       <w:pPr>
@@ -4481,15 +4368,7 @@
     <w:p/>
     <w:p>
       <w:r>
-        <w:t xml:space="preserve">Only the </w:t>
-      </w:r>
-      <w:proofErr w:type="gramStart"/>
-      <w:r>
-        <w:t>refresh</w:t>
-      </w:r>
-      <w:proofErr w:type="gramEnd"/>
-      <w:r>
-        <w:t xml:space="preserve"> action should be visible. Open and reveal-folder actions are not part of the current training workflow.</w:t>
+        <w:t>Only the refresh action should be visible. Open and reveal-folder actions are not part of the current training workflow.</w:t>
       </w:r>
     </w:p>
     <w:p/>
@@ -4557,6 +4436,7 @@
       </w:pPr>
       <w:bookmarkStart w:id="11" w:name="_Toc236825251"/>
       <w:r>
+        <w:lastRenderedPageBreak/>
         <w:t>8. M-Geo Review</w:t>
       </w:r>
       <w:bookmarkEnd w:id="11"/>
@@ -4684,7 +4564,6 @@
         <w:pStyle w:val="ListParagraph"/>
       </w:pPr>
       <w:r>
-        <w:lastRenderedPageBreak/>
         <w:t>Review the distance, rotation, scale, and warning details.</w:t>
       </w:r>
     </w:p>
@@ -4716,15 +4595,7 @@
     <w:p/>
     <w:p>
       <w:r>
-        <w:t xml:space="preserve">The overlay is </w:t>
-      </w:r>
-      <w:proofErr w:type="gramStart"/>
-      <w:r>
-        <w:t>transaction-specific</w:t>
-      </w:r>
-      <w:proofErr w:type="gramEnd"/>
-      <w:r>
-        <w:t>. It is saved in the transaction output geodatabase when possible and can be reloaded later for the same transaction.</w:t>
+        <w:t>The overlay is transaction-specific. It is saved in the transaction output geodatabase when possible and can be reloaded later for the same transaction.</w:t>
       </w:r>
     </w:p>
     <w:p/>
@@ -4742,15 +4613,7 @@
         <w:t>06-mgeo-window.png</w:t>
       </w:r>
       <w:r>
-        <w:t xml:space="preserve"> - PDF view, reference fields, map/control fields, </w:t>
-      </w:r>
-      <w:proofErr w:type="gramStart"/>
-      <w:r>
-        <w:t>Calculate</w:t>
-      </w:r>
-      <w:proofErr w:type="gramEnd"/>
-      <w:r>
-        <w:t xml:space="preserve"> fit, Create Overlay.]</w:t>
+        <w:t xml:space="preserve"> - PDF view, reference fields, map/control fields, Calculate fit, Create Overlay.]</w:t>
       </w:r>
     </w:p>
     <w:p>
@@ -4773,6 +4636,7 @@
     <w:p/>
     <w:p>
       <w:r>
+        <w:lastRenderedPageBreak/>
         <w:t>Expected result:</w:t>
       </w:r>
     </w:p>
@@ -4790,15 +4654,7 @@
         <w:pStyle w:val="ListParagraph"/>
       </w:pPr>
       <w:r>
-        <w:t xml:space="preserve">The overlay is transparent enough to compare against imagery and </w:t>
-      </w:r>
-      <w:proofErr w:type="spellStart"/>
-      <w:r>
-        <w:t>cadastre</w:t>
-      </w:r>
-      <w:proofErr w:type="spellEnd"/>
-      <w:r>
-        <w:t xml:space="preserve"> layers.</w:t>
+        <w:t>The overlay is transparent enough to compare against imagery and cadastre layers.</w:t>
       </w:r>
     </w:p>
     <w:p>
@@ -4814,15 +4670,7 @@
         <w:pStyle w:val="ListParagraph"/>
       </w:pPr>
       <w:r>
-        <w:t xml:space="preserve">Cancel, Suspend, or Finalize removes transaction-specific M-Geo </w:t>
-      </w:r>
-      <w:proofErr w:type="gramStart"/>
-      <w:r>
-        <w:t>overlay layers</w:t>
-      </w:r>
-      <w:proofErr w:type="gramEnd"/>
-      <w:r>
-        <w:t xml:space="preserve"> from the map.</w:t>
+        <w:t>Cancel, Suspend, or Finalize removes transaction-specific M-Geo overlay layers from the map.</w:t>
       </w:r>
     </w:p>
     <w:p/>
@@ -4866,16 +4714,7 @@
         <w:pStyle w:val="ListParagraph"/>
       </w:pPr>
       <w:r>
-        <w:lastRenderedPageBreak/>
-        <w:t xml:space="preserve">Source </w:t>
-      </w:r>
-      <w:proofErr w:type="gramStart"/>
-      <w:r>
-        <w:t>Verification:</w:t>
-      </w:r>
-      <w:proofErr w:type="gramEnd"/>
-      <w:r>
-        <w:t xml:space="preserve"> displays the source PDF.</w:t>
+        <w:t>Source Verification: displays the source PDF.</w:t>
       </w:r>
     </w:p>
     <w:p>
@@ -4951,6 +4790,7 @@
     <w:p/>
     <w:p>
       <w:r>
+        <w:lastRenderedPageBreak/>
         <w:t>Review each segment against the PDF:</w:t>
       </w:r>
     </w:p>
@@ -5065,7 +4905,6 @@
         <w:pStyle w:val="ListParagraph"/>
       </w:pPr>
       <w:r>
-        <w:lastRenderedPageBreak/>
         <w:t>Delete point: remove an incorrect point. The tool must ask for confirmation before deletion and refresh the list afterward.</w:t>
       </w:r>
     </w:p>
@@ -5125,6 +4964,7 @@
         <w:pStyle w:val="ListParagraph"/>
       </w:pPr>
       <w:r>
+        <w:lastRenderedPageBreak/>
         <w:t>No rows still need examiner review.</w:t>
       </w:r>
     </w:p>
@@ -5220,77 +5060,69 @@
     <w:p/>
     <w:p>
       <w:r>
-        <w:t xml:space="preserve">After points and lines are validated, use Create Spatial Units to create </w:t>
-      </w:r>
-      <w:proofErr w:type="gramStart"/>
-      <w:r>
-        <w:t>the parcel</w:t>
-      </w:r>
-      <w:proofErr w:type="gramEnd"/>
-      <w:r>
-        <w:t xml:space="preserve"> geometry for review.</w:t>
-      </w:r>
-    </w:p>
-    <w:p/>
-    <w:p>
+        <w:t>After points and lines are validated, use Create Spatial Units to create the parcel geometry for review.</w:t>
+      </w:r>
+    </w:p>
+    <w:p/>
+    <w:p>
+      <w:r>
+        <w:t>Expected map behavior:</w:t>
+      </w:r>
+    </w:p>
+    <w:p/>
+    <w:p>
+      <w:pPr>
+        <w:pStyle w:val="ListParagraph"/>
+      </w:pPr>
+      <w:r>
+        <w:t>The working map is created or reused from configuration.</w:t>
+      </w:r>
+    </w:p>
+    <w:p>
+      <w:pPr>
+        <w:pStyle w:val="ListParagraph"/>
+      </w:pPr>
+      <w:r>
+        <w:t>The map coordinate system is JAD2001 / EPSG:3448.</w:t>
+      </w:r>
+    </w:p>
+    <w:p>
+      <w:pPr>
+        <w:pStyle w:val="ListParagraph"/>
+      </w:pPr>
+      <w:r>
+        <w:t>The parcel point layer uses black border and white fill.</w:t>
+      </w:r>
+    </w:p>
+    <w:p>
+      <w:pPr>
+        <w:pStyle w:val="ListParagraph"/>
+      </w:pPr>
+      <w:r>
+        <w:t>The parcel polygon layer uses configured transparency.</w:t>
+      </w:r>
+    </w:p>
+    <w:p>
+      <w:pPr>
+        <w:pStyle w:val="ListParagraph"/>
+      </w:pPr>
+      <w:r>
+        <w:t>The Load Layers button loads local file geodatabase outputs when available and zooms to the transaction parcel.</w:t>
+      </w:r>
+    </w:p>
+    <w:p/>
+    <w:p>
+      <w:r>
+        <w:t>Final Review lets the examiner inspect the generated geometry in ArcGIS Pro before finalizing.</w:t>
+      </w:r>
+    </w:p>
+    <w:p/>
+    <w:p>
+      <w:pPr>
+        <w:pStyle w:val="ScreenshotPlaceholder"/>
+      </w:pPr>
       <w:r>
         <w:lastRenderedPageBreak/>
-        <w:t>Expected map behavior:</w:t>
-      </w:r>
-    </w:p>
-    <w:p/>
-    <w:p>
-      <w:pPr>
-        <w:pStyle w:val="ListParagraph"/>
-      </w:pPr>
-      <w:r>
-        <w:t>The working map is created or reused from configuration.</w:t>
-      </w:r>
-    </w:p>
-    <w:p>
-      <w:pPr>
-        <w:pStyle w:val="ListParagraph"/>
-      </w:pPr>
-      <w:r>
-        <w:t>The map coordinate system is JAD2001 / EPSG:3448.</w:t>
-      </w:r>
-    </w:p>
-    <w:p>
-      <w:pPr>
-        <w:pStyle w:val="ListParagraph"/>
-      </w:pPr>
-      <w:r>
-        <w:t>The parcel point layer uses black border and white fill.</w:t>
-      </w:r>
-    </w:p>
-    <w:p>
-      <w:pPr>
-        <w:pStyle w:val="ListParagraph"/>
-      </w:pPr>
-      <w:r>
-        <w:t>The parcel polygon layer uses configured transparency.</w:t>
-      </w:r>
-    </w:p>
-    <w:p>
-      <w:pPr>
-        <w:pStyle w:val="ListParagraph"/>
-      </w:pPr>
-      <w:r>
-        <w:t>The Load Layers button loads local file geodatabase outputs when available and zooms to the transaction parcel.</w:t>
-      </w:r>
-    </w:p>
-    <w:p/>
-    <w:p>
-      <w:r>
-        <w:t>Final Review lets the examiner inspect the generated geometry in ArcGIS Pro before finalizing.</w:t>
-      </w:r>
-    </w:p>
-    <w:p/>
-    <w:p>
-      <w:pPr>
-        <w:pStyle w:val="ScreenshotPlaceholder"/>
-      </w:pPr>
-      <w:r>
         <w:t xml:space="preserve">[Screenshot placeholder: </w:t>
       </w:r>
       <w:r>
@@ -5347,13 +5179,8 @@
       <w:pPr>
         <w:pStyle w:val="ListParagraph"/>
       </w:pPr>
-      <w:proofErr w:type="gramStart"/>
-      <w:r>
-        <w:t>Finalize</w:t>
-      </w:r>
-      <w:proofErr w:type="gramEnd"/>
-      <w:r>
-        <w:t xml:space="preserve"> is available only when the workflow is ready.</w:t>
+      <w:r>
+        <w:t>Finalize is available only when the workflow is ready.</w:t>
       </w:r>
     </w:p>
     <w:p/>
@@ -5485,38 +5312,15 @@
         <w:pStyle w:val="ListParagraph"/>
       </w:pPr>
       <w:r>
-        <w:t xml:space="preserve">Legal </w:t>
-      </w:r>
-      <w:proofErr w:type="spellStart"/>
-      <w:r>
-        <w:t>Cadastre</w:t>
-      </w:r>
-      <w:proofErr w:type="spellEnd"/>
-      <w:r>
-        <w:t xml:space="preserve">, Fiscal </w:t>
-      </w:r>
-      <w:proofErr w:type="spellStart"/>
-      <w:r>
-        <w:t>Cadastre</w:t>
-      </w:r>
-      <w:proofErr w:type="spellEnd"/>
-      <w:r>
-        <w:t xml:space="preserve">, and Survey </w:t>
-      </w:r>
-      <w:proofErr w:type="spellStart"/>
-      <w:r>
-        <w:t>Cadastre</w:t>
-      </w:r>
-      <w:proofErr w:type="spellEnd"/>
-      <w:r>
-        <w:t xml:space="preserve"> evidence layers are queried using the configured spatial search mode.</w:t>
-      </w:r>
-    </w:p>
-    <w:p>
-      <w:pPr>
-        <w:pStyle w:val="ListParagraph"/>
-      </w:pPr>
-      <w:r>
+        <w:t>Legal Cadastre, Fiscal Cadastre, and Survey Cadastre evidence layers are queried using the configured spatial search mode.</w:t>
+      </w:r>
+    </w:p>
+    <w:p>
+      <w:pPr>
+        <w:pStyle w:val="ListParagraph"/>
+      </w:pPr>
+      <w:r>
+        <w:lastRenderedPageBreak/>
         <w:t>Neighbor evidence layers are styled as read-only context with dotted lines, 70% or greater transparency, and distinct colors.</w:t>
       </w:r>
     </w:p>
@@ -5579,13 +5383,8 @@
         <w:pStyle w:val="Heading2"/>
       </w:pPr>
       <w:bookmarkStart w:id="19" w:name="_Toc236825259"/>
-      <w:proofErr w:type="spellStart"/>
-      <w:r>
-        <w:t>Innola</w:t>
-      </w:r>
-      <w:proofErr w:type="spellEnd"/>
-      <w:r>
-        <w:t xml:space="preserve"> Searches</w:t>
+      <w:r>
+        <w:t>Innola Searches</w:t>
       </w:r>
       <w:bookmarkEnd w:id="19"/>
     </w:p>
@@ -5624,19 +5423,13 @@
       <w:pPr>
         <w:pStyle w:val="ListParagraph"/>
       </w:pPr>
-      <w:proofErr w:type="spellStart"/>
-      <w:r>
-        <w:t>LandVal</w:t>
-      </w:r>
-      <w:proofErr w:type="spellEnd"/>
-      <w:r>
-        <w:t xml:space="preserve"> No.</w:t>
-      </w:r>
-    </w:p>
-    <w:p/>
-    <w:p>
-      <w:r>
-        <w:lastRenderedPageBreak/>
+      <w:r>
+        <w:t>LandVal No.</w:t>
+      </w:r>
+    </w:p>
+    <w:p/>
+    <w:p>
+      <w:r>
         <w:t>Use the exact field requested by the form. For Volume/Folio, enter the volume and folio in their separate fields when available.</w:t>
       </w:r>
     </w:p>
@@ -5670,15 +5463,7 @@
         <w:pStyle w:val="ListParagraph"/>
       </w:pPr>
       <w:r>
-        <w:t xml:space="preserve">Search results are shown when matching </w:t>
-      </w:r>
-      <w:proofErr w:type="spellStart"/>
-      <w:r>
-        <w:t>Innola</w:t>
-      </w:r>
-      <w:proofErr w:type="spellEnd"/>
-      <w:r>
-        <w:t xml:space="preserve"> records exist.</w:t>
+        <w:t>Search results are shown when matching Innola records exist.</w:t>
       </w:r>
     </w:p>
     <w:p>
@@ -5703,6 +5488,7 @@
     <w:p/>
     <w:p>
       <w:r>
+        <w:lastRenderedPageBreak/>
         <w:t>The action buttons have different meanings. Use the correct action for the state of the work.</w:t>
       </w:r>
     </w:p>
@@ -5712,12 +5498,6 @@
         <w:tblStyle w:val="TableGrid"/>
         <w:tblW w:w="0" w:type="auto"/>
         <w:tblInd w:w="5" w:type="dxa"/>
-        <w:tblCellMar>
-          <w:top w:w="0" w:type="dxa"/>
-          <w:left w:w="0" w:type="dxa"/>
-          <w:bottom w:w="0" w:type="dxa"/>
-          <w:right w:w="0" w:type="dxa"/>
-        </w:tblCellMar>
         <w:tblLook w:val="04A0" w:firstRow="1" w:lastRow="0" w:firstColumn="1" w:lastColumn="0" w:noHBand="0" w:noVBand="1"/>
       </w:tblPr>
       <w:tblGrid>
@@ -5726,14 +5506,6 @@
         <w:gridCol w:w="2400"/>
       </w:tblGrid>
       <w:tr>
-        <w:tblPrEx>
-          <w:tblCellMar>
-            <w:top w:w="0" w:type="dxa"/>
-            <w:left w:w="0" w:type="dxa"/>
-            <w:bottom w:w="0" w:type="dxa"/>
-            <w:right w:w="0" w:type="dxa"/>
-          </w:tblCellMar>
-        </w:tblPrEx>
         <w:tc>
           <w:tcPr>
             <w:tcW w:w="2400" w:type="dxa"/>
@@ -5775,14 +5547,6 @@
         </w:tc>
       </w:tr>
       <w:tr>
-        <w:tblPrEx>
-          <w:tblCellMar>
-            <w:top w:w="0" w:type="dxa"/>
-            <w:left w:w="0" w:type="dxa"/>
-            <w:bottom w:w="0" w:type="dxa"/>
-            <w:right w:w="0" w:type="dxa"/>
-          </w:tblCellMar>
-        </w:tblPrEx>
         <w:tc>
           <w:tcPr>
             <w:tcW w:w="2400" w:type="dxa"/>
@@ -5799,46 +5563,22 @@
           </w:tcPr>
           <w:p>
             <w:r>
-              <w:t xml:space="preserve">Saves </w:t>
-            </w:r>
-            <w:proofErr w:type="gramStart"/>
-            <w:r>
-              <w:t>current status</w:t>
-            </w:r>
-            <w:proofErr w:type="gramEnd"/>
-            <w:r>
-              <w:t xml:space="preserve"> and creates the current report/output where applicable. Does not close the task.</w:t>
-            </w:r>
-          </w:p>
-        </w:tc>
-        <w:tc>
-          <w:tcPr>
-            <w:tcW w:w="2400" w:type="dxa"/>
-          </w:tcPr>
-          <w:p>
-            <w:r>
-              <w:t xml:space="preserve">Saves current search/evidence state and regenerates the report where applicable. </w:t>
-            </w:r>
-            <w:proofErr w:type="gramStart"/>
-            <w:r>
-              <w:t>Finalize</w:t>
-            </w:r>
-            <w:proofErr w:type="gramEnd"/>
-            <w:r>
-              <w:t xml:space="preserve"> becomes available after at least one valid save.</w:t>
+              <w:t>Saves current status and creates the current report/output where applicable. Does not close the task.</w:t>
+            </w:r>
+          </w:p>
+        </w:tc>
+        <w:tc>
+          <w:tcPr>
+            <w:tcW w:w="2400" w:type="dxa"/>
+          </w:tcPr>
+          <w:p>
+            <w:r>
+              <w:t>Saves current search/evidence state and regenerates the report where applicable. Finalize becomes available after at least one valid save.</w:t>
             </w:r>
           </w:p>
         </w:tc>
       </w:tr>
       <w:tr>
-        <w:tblPrEx>
-          <w:tblCellMar>
-            <w:top w:w="0" w:type="dxa"/>
-            <w:left w:w="0" w:type="dxa"/>
-            <w:bottom w:w="0" w:type="dxa"/>
-            <w:right w:w="0" w:type="dxa"/>
-          </w:tblCellMar>
-        </w:tblPrEx>
         <w:tc>
           <w:tcPr>
             <w:tcW w:w="2400" w:type="dxa"/>
@@ -5855,46 +5595,22 @@
           </w:tcPr>
           <w:p>
             <w:r>
-              <w:t xml:space="preserve">Saves </w:t>
-            </w:r>
-            <w:proofErr w:type="gramStart"/>
-            <w:r>
-              <w:t>current status</w:t>
-            </w:r>
-            <w:proofErr w:type="gramEnd"/>
-            <w:r>
-              <w:t>, uploads resumable status to the transaction, clears the form, and removes transaction map content.</w:t>
-            </w:r>
-          </w:p>
-        </w:tc>
-        <w:tc>
-          <w:tcPr>
-            <w:tcW w:w="2400" w:type="dxa"/>
-          </w:tcPr>
-          <w:p>
-            <w:r>
-              <w:t xml:space="preserve">Saves </w:t>
-            </w:r>
-            <w:proofErr w:type="gramStart"/>
-            <w:r>
-              <w:t>current status</w:t>
-            </w:r>
-            <w:proofErr w:type="gramEnd"/>
-            <w:r>
-              <w:t xml:space="preserve"> through the lifecycle bridge, uploads resumable status, closes Compare, and removes transaction map content.</w:t>
+              <w:t>Saves current status, uploads resumable status to the transaction, clears the form, and removes transaction map content.</w:t>
+            </w:r>
+          </w:p>
+        </w:tc>
+        <w:tc>
+          <w:tcPr>
+            <w:tcW w:w="2400" w:type="dxa"/>
+          </w:tcPr>
+          <w:p>
+            <w:r>
+              <w:t>Saves current status through the lifecycle bridge, uploads resumable status, closes Compare, and removes transaction map content.</w:t>
             </w:r>
           </w:p>
         </w:tc>
       </w:tr>
       <w:tr>
-        <w:tblPrEx>
-          <w:tblCellMar>
-            <w:top w:w="0" w:type="dxa"/>
-            <w:left w:w="0" w:type="dxa"/>
-            <w:bottom w:w="0" w:type="dxa"/>
-            <w:right w:w="0" w:type="dxa"/>
-          </w:tblCellMar>
-        </w:tblPrEx>
         <w:tc>
           <w:tcPr>
             <w:tcW w:w="2400" w:type="dxa"/>
@@ -5921,31 +5637,18 @@
           </w:tcPr>
           <w:p>
             <w:r>
-              <w:t xml:space="preserve">Saves final status, uploads the PDF report to the transaction, moves the Compare task forward, shows a completion message, closes Compare, and removes transaction </w:t>
-            </w:r>
-            <w:r>
-              <w:lastRenderedPageBreak/>
-              <w:t>map content including M-Geo overlay.</w:t>
+              <w:t>Saves final status, uploads the PDF report to the transaction, moves the Compare task forward, shows a completion message, closes Compare, and removes transaction map content including M-Geo overlay.</w:t>
             </w:r>
           </w:p>
         </w:tc>
       </w:tr>
       <w:tr>
-        <w:tblPrEx>
-          <w:tblCellMar>
-            <w:top w:w="0" w:type="dxa"/>
-            <w:left w:w="0" w:type="dxa"/>
-            <w:bottom w:w="0" w:type="dxa"/>
-            <w:right w:w="0" w:type="dxa"/>
-          </w:tblCellMar>
-        </w:tblPrEx>
-        <w:tc>
-          <w:tcPr>
-            <w:tcW w:w="2400" w:type="dxa"/>
-          </w:tcPr>
-          <w:p>
-            <w:r>
-              <w:lastRenderedPageBreak/>
+        <w:tc>
+          <w:tcPr>
+            <w:tcW w:w="2400" w:type="dxa"/>
+          </w:tcPr>
+          <w:p>
+            <w:r>
               <w:t>Cancel</w:t>
             </w:r>
           </w:p>
@@ -6010,6 +5713,7 @@
         <w:pStyle w:val="ListParagraph"/>
       </w:pPr>
       <w:r>
+        <w:lastRenderedPageBreak/>
         <w:t>Cancel and Suspend are disabled.</w:t>
       </w:r>
     </w:p>
@@ -6026,15 +5730,7 @@
         <w:pStyle w:val="ListParagraph"/>
       </w:pPr>
       <w:r>
-        <w:t xml:space="preserve">The Transactions List refreshes and no stale transaction content </w:t>
-      </w:r>
-      <w:proofErr w:type="gramStart"/>
-      <w:r>
-        <w:t>remains</w:t>
-      </w:r>
-      <w:proofErr w:type="gramEnd"/>
-      <w:r>
-        <w:t>.</w:t>
+        <w:t>The Transactions List refreshes and no stale transaction content remains.</w:t>
       </w:r>
     </w:p>
     <w:p/>
@@ -6103,46 +5799,27 @@
         <w:pStyle w:val="ListParagraph"/>
       </w:pPr>
       <w:r>
-        <w:t xml:space="preserve">Assigned </w:t>
-      </w:r>
-      <w:proofErr w:type="gramStart"/>
-      <w:r>
-        <w:t xml:space="preserve">user: </w:t>
+        <w:t xml:space="preserve">Assigned user: </w:t>
       </w:r>
       <w:r>
         <w:rPr>
           <w:rStyle w:val="CodeChar"/>
         </w:rPr>
-        <w:t>_</w:t>
-      </w:r>
-      <w:proofErr w:type="gramEnd"/>
+        <w:t>____________</w:t>
+      </w:r>
+    </w:p>
+    <w:p>
+      <w:pPr>
+        <w:pStyle w:val="ListParagraph"/>
+      </w:pPr>
+      <w:r>
+        <w:t xml:space="preserve">Parish: </w:t>
+      </w:r>
       <w:r>
         <w:rPr>
           <w:rStyle w:val="CodeChar"/>
         </w:rPr>
-        <w:t>___________</w:t>
-      </w:r>
-    </w:p>
-    <w:p>
-      <w:pPr>
-        <w:pStyle w:val="ListParagraph"/>
-      </w:pPr>
-      <w:proofErr w:type="gramStart"/>
-      <w:r>
-        <w:t xml:space="preserve">Parish: </w:t>
-      </w:r>
-      <w:r>
-        <w:rPr>
-          <w:rStyle w:val="CodeChar"/>
-        </w:rPr>
-        <w:t>_</w:t>
-      </w:r>
-      <w:proofErr w:type="gramEnd"/>
-      <w:r>
-        <w:rPr>
-          <w:rStyle w:val="CodeChar"/>
-        </w:rPr>
-        <w:t>___________</w:t>
+        <w:t>____________</w:t>
       </w:r>
     </w:p>
     <w:p>
@@ -6176,12 +5853,6 @@
         <w:tblStyle w:val="TableGrid"/>
         <w:tblW w:w="0" w:type="auto"/>
         <w:tblInd w:w="5" w:type="dxa"/>
-        <w:tblCellMar>
-          <w:top w:w="0" w:type="dxa"/>
-          <w:left w:w="0" w:type="dxa"/>
-          <w:bottom w:w="0" w:type="dxa"/>
-          <w:right w:w="0" w:type="dxa"/>
-        </w:tblCellMar>
         <w:tblLook w:val="04A0" w:firstRow="1" w:lastRow="0" w:firstColumn="1" w:lastColumn="0" w:noHBand="0" w:noVBand="1"/>
       </w:tblPr>
       <w:tblGrid>
@@ -6192,14 +5863,6 @@
         <w:gridCol w:w="2221"/>
       </w:tblGrid>
       <w:tr>
-        <w:tblPrEx>
-          <w:tblCellMar>
-            <w:top w:w="0" w:type="dxa"/>
-            <w:left w:w="0" w:type="dxa"/>
-            <w:bottom w:w="0" w:type="dxa"/>
-            <w:right w:w="0" w:type="dxa"/>
-          </w:tblCellMar>
-        </w:tblPrEx>
         <w:tc>
           <w:tcPr>
             <w:tcW w:w="2400" w:type="dxa"/>
@@ -6209,7 +5872,6 @@
               <w:pStyle w:val="TableHeader"/>
             </w:pPr>
             <w:r>
-              <w:lastRenderedPageBreak/>
               <w:t>Step</w:t>
             </w:r>
           </w:p>
@@ -6268,14 +5930,6 @@
         </w:tc>
       </w:tr>
       <w:tr>
-        <w:tblPrEx>
-          <w:tblCellMar>
-            <w:top w:w="0" w:type="dxa"/>
-            <w:left w:w="0" w:type="dxa"/>
-            <w:bottom w:w="0" w:type="dxa"/>
-            <w:right w:w="0" w:type="dxa"/>
-          </w:tblCellMar>
-        </w:tblPrEx>
         <w:tc>
           <w:tcPr>
             <w:tcW w:w="2400" w:type="dxa"/>
@@ -6301,13 +5955,8 @@
             <w:tcW w:w="2400" w:type="dxa"/>
           </w:tcPr>
           <w:p>
-            <w:proofErr w:type="gramStart"/>
-            <w:r>
-              <w:t>User name</w:t>
-            </w:r>
-            <w:proofErr w:type="gramEnd"/>
-            <w:r>
-              <w:t xml:space="preserve"> and connection details are shown.</w:t>
+            <w:r>
+              <w:t>User name and connection details are shown.</w:t>
             </w:r>
           </w:p>
         </w:tc>
@@ -6329,14 +5978,6 @@
         </w:tc>
       </w:tr>
       <w:tr>
-        <w:tblPrEx>
-          <w:tblCellMar>
-            <w:top w:w="0" w:type="dxa"/>
-            <w:left w:w="0" w:type="dxa"/>
-            <w:bottom w:w="0" w:type="dxa"/>
-            <w:right w:w="0" w:type="dxa"/>
-          </w:tblCellMar>
-        </w:tblPrEx>
         <w:tc>
           <w:tcPr>
             <w:tcW w:w="2400" w:type="dxa"/>
@@ -6385,14 +6026,6 @@
         </w:tc>
       </w:tr>
       <w:tr>
-        <w:tblPrEx>
-          <w:tblCellMar>
-            <w:top w:w="0" w:type="dxa"/>
-            <w:left w:w="0" w:type="dxa"/>
-            <w:bottom w:w="0" w:type="dxa"/>
-            <w:right w:w="0" w:type="dxa"/>
-          </w:tblCellMar>
-        </w:tblPrEx>
         <w:tc>
           <w:tcPr>
             <w:tcW w:w="2400" w:type="dxa"/>
@@ -6441,14 +6074,6 @@
         </w:tc>
       </w:tr>
       <w:tr>
-        <w:tblPrEx>
-          <w:tblCellMar>
-            <w:top w:w="0" w:type="dxa"/>
-            <w:left w:w="0" w:type="dxa"/>
-            <w:bottom w:w="0" w:type="dxa"/>
-            <w:right w:w="0" w:type="dxa"/>
-          </w:tblCellMar>
-        </w:tblPrEx>
         <w:tc>
           <w:tcPr>
             <w:tcW w:w="2400" w:type="dxa"/>
@@ -6497,14 +6122,6 @@
         </w:tc>
       </w:tr>
       <w:tr>
-        <w:tblPrEx>
-          <w:tblCellMar>
-            <w:top w:w="0" w:type="dxa"/>
-            <w:left w:w="0" w:type="dxa"/>
-            <w:bottom w:w="0" w:type="dxa"/>
-            <w:right w:w="0" w:type="dxa"/>
-          </w:tblCellMar>
-        </w:tblPrEx>
         <w:tc>
           <w:tcPr>
             <w:tcW w:w="2400" w:type="dxa"/>
@@ -6553,20 +6170,13 @@
         </w:tc>
       </w:tr>
       <w:tr>
-        <w:tblPrEx>
-          <w:tblCellMar>
-            <w:top w:w="0" w:type="dxa"/>
-            <w:left w:w="0" w:type="dxa"/>
-            <w:bottom w:w="0" w:type="dxa"/>
-            <w:right w:w="0" w:type="dxa"/>
-          </w:tblCellMar>
-        </w:tblPrEx>
-        <w:tc>
-          <w:tcPr>
-            <w:tcW w:w="2400" w:type="dxa"/>
-          </w:tcPr>
-          <w:p>
-            <w:r>
+        <w:tc>
+          <w:tcPr>
+            <w:tcW w:w="2400" w:type="dxa"/>
+          </w:tcPr>
+          <w:p>
+            <w:r>
+              <w:lastRenderedPageBreak/>
               <w:t>6</w:t>
             </w:r>
           </w:p>
@@ -6605,14 +6215,6 @@
         </w:tc>
       </w:tr>
       <w:tr>
-        <w:tblPrEx>
-          <w:tblCellMar>
-            <w:top w:w="0" w:type="dxa"/>
-            <w:left w:w="0" w:type="dxa"/>
-            <w:bottom w:w="0" w:type="dxa"/>
-            <w:right w:w="0" w:type="dxa"/>
-          </w:tblCellMar>
-        </w:tblPrEx>
         <w:tc>
           <w:tcPr>
             <w:tcW w:w="2400" w:type="dxa"/>
@@ -6629,15 +6231,7 @@
           </w:tcPr>
           <w:p>
             <w:r>
-              <w:t xml:space="preserve">Run </w:t>
-            </w:r>
-            <w:proofErr w:type="spellStart"/>
-            <w:r>
-              <w:t>Georeference</w:t>
-            </w:r>
-            <w:proofErr w:type="spellEnd"/>
-            <w:r>
-              <w:t xml:space="preserve"> Check.</w:t>
+              <w:t>Run Georeference Check.</w:t>
             </w:r>
           </w:p>
         </w:tc>
@@ -6665,14 +6259,6 @@
         </w:tc>
       </w:tr>
       <w:tr>
-        <w:tblPrEx>
-          <w:tblCellMar>
-            <w:top w:w="0" w:type="dxa"/>
-            <w:left w:w="0" w:type="dxa"/>
-            <w:bottom w:w="0" w:type="dxa"/>
-            <w:right w:w="0" w:type="dxa"/>
-          </w:tblCellMar>
-        </w:tblPrEx>
         <w:tc>
           <w:tcPr>
             <w:tcW w:w="2400" w:type="dxa"/>
@@ -6717,14 +6303,6 @@
         </w:tc>
       </w:tr>
       <w:tr>
-        <w:tblPrEx>
-          <w:tblCellMar>
-            <w:top w:w="0" w:type="dxa"/>
-            <w:left w:w="0" w:type="dxa"/>
-            <w:bottom w:w="0" w:type="dxa"/>
-            <w:right w:w="0" w:type="dxa"/>
-          </w:tblCellMar>
-        </w:tblPrEx>
         <w:tc>
           <w:tcPr>
             <w:tcW w:w="2400" w:type="dxa"/>
@@ -6773,14 +6351,6 @@
         </w:tc>
       </w:tr>
       <w:tr>
-        <w:tblPrEx>
-          <w:tblCellMar>
-            <w:top w:w="0" w:type="dxa"/>
-            <w:left w:w="0" w:type="dxa"/>
-            <w:bottom w:w="0" w:type="dxa"/>
-            <w:right w:w="0" w:type="dxa"/>
-          </w:tblCellMar>
-        </w:tblPrEx>
         <w:tc>
           <w:tcPr>
             <w:tcW w:w="2400" w:type="dxa"/>
@@ -6829,14 +6399,6 @@
         </w:tc>
       </w:tr>
       <w:tr>
-        <w:tblPrEx>
-          <w:tblCellMar>
-            <w:top w:w="0" w:type="dxa"/>
-            <w:left w:w="0" w:type="dxa"/>
-            <w:bottom w:w="0" w:type="dxa"/>
-            <w:right w:w="0" w:type="dxa"/>
-          </w:tblCellMar>
-        </w:tblPrEx>
         <w:tc>
           <w:tcPr>
             <w:tcW w:w="2400" w:type="dxa"/>
@@ -6881,14 +6443,6 @@
         </w:tc>
       </w:tr>
       <w:tr>
-        <w:tblPrEx>
-          <w:tblCellMar>
-            <w:top w:w="0" w:type="dxa"/>
-            <w:left w:w="0" w:type="dxa"/>
-            <w:bottom w:w="0" w:type="dxa"/>
-            <w:right w:w="0" w:type="dxa"/>
-          </w:tblCellMar>
-        </w:tblPrEx>
         <w:tc>
           <w:tcPr>
             <w:tcW w:w="2400" w:type="dxa"/>
@@ -6937,14 +6491,6 @@
         </w:tc>
       </w:tr>
       <w:tr>
-        <w:tblPrEx>
-          <w:tblCellMar>
-            <w:top w:w="0" w:type="dxa"/>
-            <w:left w:w="0" w:type="dxa"/>
-            <w:bottom w:w="0" w:type="dxa"/>
-            <w:right w:w="0" w:type="dxa"/>
-          </w:tblCellMar>
-        </w:tblPrEx>
         <w:tc>
           <w:tcPr>
             <w:tcW w:w="2400" w:type="dxa"/>
@@ -6971,19 +6517,7 @@
           </w:tcPr>
           <w:p>
             <w:r>
-              <w:t xml:space="preserve">Local output layers load and map </w:t>
-            </w:r>
-            <w:proofErr w:type="gramStart"/>
-            <w:r>
-              <w:t>zooms</w:t>
-            </w:r>
-            <w:proofErr w:type="gramEnd"/>
-            <w:r>
-              <w:t xml:space="preserve"> </w:t>
-            </w:r>
-            <w:r>
-              <w:lastRenderedPageBreak/>
-              <w:t>to parcel.</w:t>
+              <w:t>Local output layers load and map zooms to parcel.</w:t>
             </w:r>
           </w:p>
         </w:tc>
@@ -7005,14 +6539,6 @@
         </w:tc>
       </w:tr>
       <w:tr>
-        <w:tblPrEx>
-          <w:tblCellMar>
-            <w:top w:w="0" w:type="dxa"/>
-            <w:left w:w="0" w:type="dxa"/>
-            <w:bottom w:w="0" w:type="dxa"/>
-            <w:right w:w="0" w:type="dxa"/>
-          </w:tblCellMar>
-        </w:tblPrEx>
         <w:tc>
           <w:tcPr>
             <w:tcW w:w="2400" w:type="dxa"/>
@@ -7061,14 +6587,6 @@
         </w:tc>
       </w:tr>
       <w:tr>
-        <w:tblPrEx>
-          <w:tblCellMar>
-            <w:top w:w="0" w:type="dxa"/>
-            <w:left w:w="0" w:type="dxa"/>
-            <w:bottom w:w="0" w:type="dxa"/>
-            <w:right w:w="0" w:type="dxa"/>
-          </w:tblCellMar>
-        </w:tblPrEx>
         <w:tc>
           <w:tcPr>
             <w:tcW w:w="2400" w:type="dxa"/>
@@ -7117,14 +6635,6 @@
         </w:tc>
       </w:tr>
       <w:tr>
-        <w:tblPrEx>
-          <w:tblCellMar>
-            <w:top w:w="0" w:type="dxa"/>
-            <w:left w:w="0" w:type="dxa"/>
-            <w:bottom w:w="0" w:type="dxa"/>
-            <w:right w:w="0" w:type="dxa"/>
-          </w:tblCellMar>
-        </w:tblPrEx>
         <w:tc>
           <w:tcPr>
             <w:tcW w:w="2400" w:type="dxa"/>
@@ -7173,14 +6683,6 @@
         </w:tc>
       </w:tr>
       <w:tr>
-        <w:tblPrEx>
-          <w:tblCellMar>
-            <w:top w:w="0" w:type="dxa"/>
-            <w:left w:w="0" w:type="dxa"/>
-            <w:bottom w:w="0" w:type="dxa"/>
-            <w:right w:w="0" w:type="dxa"/>
-          </w:tblCellMar>
-        </w:tblPrEx>
         <w:tc>
           <w:tcPr>
             <w:tcW w:w="2400" w:type="dxa"/>
@@ -7197,33 +6699,17 @@
           </w:tcPr>
           <w:p>
             <w:r>
-              <w:t xml:space="preserve">Run </w:t>
-            </w:r>
-            <w:proofErr w:type="spellStart"/>
-            <w:r>
-              <w:t>Innola</w:t>
-            </w:r>
-            <w:proofErr w:type="spellEnd"/>
-            <w:r>
-              <w:t xml:space="preserve"> searches.</w:t>
-            </w:r>
-          </w:p>
-        </w:tc>
-        <w:tc>
-          <w:tcPr>
-            <w:tcW w:w="2400" w:type="dxa"/>
-          </w:tcPr>
-          <w:p>
-            <w:r>
-              <w:t xml:space="preserve">Name, PID, Volume/Folio, or </w:t>
-            </w:r>
-            <w:proofErr w:type="spellStart"/>
-            <w:r>
-              <w:t>LandVal</w:t>
-            </w:r>
-            <w:proofErr w:type="spellEnd"/>
-            <w:r>
-              <w:t xml:space="preserve"> results are returned when matching records exist.</w:t>
+              <w:t>Run Innola searches.</w:t>
+            </w:r>
+          </w:p>
+        </w:tc>
+        <w:tc>
+          <w:tcPr>
+            <w:tcW w:w="2400" w:type="dxa"/>
+          </w:tcPr>
+          <w:p>
+            <w:r>
+              <w:t>Name, PID, Volume/Folio, or LandVal results are returned when matching records exist.</w:t>
             </w:r>
           </w:p>
         </w:tc>
@@ -7245,14 +6731,6 @@
         </w:tc>
       </w:tr>
       <w:tr>
-        <w:tblPrEx>
-          <w:tblCellMar>
-            <w:top w:w="0" w:type="dxa"/>
-            <w:left w:w="0" w:type="dxa"/>
-            <w:bottom w:w="0" w:type="dxa"/>
-            <w:right w:w="0" w:type="dxa"/>
-          </w:tblCellMar>
-        </w:tblPrEx>
         <w:tc>
           <w:tcPr>
             <w:tcW w:w="2400" w:type="dxa"/>
@@ -7279,7 +6757,11 @@
           </w:tcPr>
           <w:p>
             <w:r>
-              <w:t>Search and evidence state is saved and Finalize is enabled.</w:t>
+              <w:t xml:space="preserve">Search and evidence </w:t>
+            </w:r>
+            <w:r>
+              <w:lastRenderedPageBreak/>
+              <w:t>state is saved and Finalize is enabled.</w:t>
             </w:r>
           </w:p>
         </w:tc>
@@ -7297,14 +6779,6 @@
         </w:tc>
       </w:tr>
       <w:tr>
-        <w:tblPrEx>
-          <w:tblCellMar>
-            <w:top w:w="0" w:type="dxa"/>
-            <w:left w:w="0" w:type="dxa"/>
-            <w:bottom w:w="0" w:type="dxa"/>
-            <w:right w:w="0" w:type="dxa"/>
-          </w:tblCellMar>
-        </w:tblPrEx>
         <w:tc>
           <w:tcPr>
             <w:tcW w:w="2400" w:type="dxa"/>
@@ -7370,12 +6844,6 @@
         <w:tblStyle w:val="TableGrid"/>
         <w:tblW w:w="0" w:type="auto"/>
         <w:tblInd w:w="5" w:type="dxa"/>
-        <w:tblCellMar>
-          <w:top w:w="0" w:type="dxa"/>
-          <w:left w:w="0" w:type="dxa"/>
-          <w:bottom w:w="0" w:type="dxa"/>
-          <w:right w:w="0" w:type="dxa"/>
-        </w:tblCellMar>
         <w:tblLook w:val="04A0" w:firstRow="1" w:lastRow="0" w:firstColumn="1" w:lastColumn="0" w:noHBand="0" w:noVBand="1"/>
       </w:tblPr>
       <w:tblGrid>
@@ -7385,14 +6853,6 @@
         <w:gridCol w:w="2400"/>
       </w:tblGrid>
       <w:tr>
-        <w:tblPrEx>
-          <w:tblCellMar>
-            <w:top w:w="0" w:type="dxa"/>
-            <w:left w:w="0" w:type="dxa"/>
-            <w:bottom w:w="0" w:type="dxa"/>
-            <w:right w:w="0" w:type="dxa"/>
-          </w:tblCellMar>
-        </w:tblPrEx>
         <w:tc>
           <w:tcPr>
             <w:tcW w:w="2400" w:type="dxa"/>
@@ -7447,14 +6907,6 @@
         </w:tc>
       </w:tr>
       <w:tr>
-        <w:tblPrEx>
-          <w:tblCellMar>
-            <w:top w:w="0" w:type="dxa"/>
-            <w:left w:w="0" w:type="dxa"/>
-            <w:bottom w:w="0" w:type="dxa"/>
-            <w:right w:w="0" w:type="dxa"/>
-          </w:tblCellMar>
-        </w:tblPrEx>
         <w:tc>
           <w:tcPr>
             <w:tcW w:w="2400" w:type="dxa"/>
@@ -7470,21 +6922,8 @@
             <w:tcW w:w="2400" w:type="dxa"/>
           </w:tcPr>
           <w:p>
-            <w:proofErr w:type="gramStart"/>
-            <w:r>
-              <w:t>User</w:t>
-            </w:r>
-            <w:proofErr w:type="gramEnd"/>
-            <w:r>
-              <w:t xml:space="preserve"> can log in using </w:t>
-            </w:r>
-            <w:proofErr w:type="spellStart"/>
-            <w:r>
-              <w:t>Innola</w:t>
-            </w:r>
-            <w:proofErr w:type="spellEnd"/>
-            <w:r>
-              <w:t xml:space="preserve"> credentials.</w:t>
+            <w:r>
+              <w:t>User can log in using Innola credentials.</w:t>
             </w:r>
           </w:p>
         </w:tc>
@@ -7502,14 +6941,6 @@
         </w:tc>
       </w:tr>
       <w:tr>
-        <w:tblPrEx>
-          <w:tblCellMar>
-            <w:top w:w="0" w:type="dxa"/>
-            <w:left w:w="0" w:type="dxa"/>
-            <w:bottom w:w="0" w:type="dxa"/>
-            <w:right w:w="0" w:type="dxa"/>
-          </w:tblCellMar>
-        </w:tblPrEx>
         <w:tc>
           <w:tcPr>
             <w:tcW w:w="2400" w:type="dxa"/>
@@ -7544,14 +6975,6 @@
         </w:tc>
       </w:tr>
       <w:tr>
-        <w:tblPrEx>
-          <w:tblCellMar>
-            <w:top w:w="0" w:type="dxa"/>
-            <w:left w:w="0" w:type="dxa"/>
-            <w:bottom w:w="0" w:type="dxa"/>
-            <w:right w:w="0" w:type="dxa"/>
-          </w:tblCellMar>
-        </w:tblPrEx>
         <w:tc>
           <w:tcPr>
             <w:tcW w:w="2400" w:type="dxa"/>
@@ -7586,14 +7009,6 @@
         </w:tc>
       </w:tr>
       <w:tr>
-        <w:tblPrEx>
-          <w:tblCellMar>
-            <w:top w:w="0" w:type="dxa"/>
-            <w:left w:w="0" w:type="dxa"/>
-            <w:bottom w:w="0" w:type="dxa"/>
-            <w:right w:w="0" w:type="dxa"/>
-          </w:tblCellMar>
-        </w:tblPrEx>
         <w:tc>
           <w:tcPr>
             <w:tcW w:w="2400" w:type="dxa"/>
@@ -7628,21 +7043,12 @@
         </w:tc>
       </w:tr>
       <w:tr>
-        <w:tblPrEx>
-          <w:tblCellMar>
-            <w:top w:w="0" w:type="dxa"/>
-            <w:left w:w="0" w:type="dxa"/>
-            <w:bottom w:w="0" w:type="dxa"/>
-            <w:right w:w="0" w:type="dxa"/>
-          </w:tblCellMar>
-        </w:tblPrEx>
-        <w:tc>
-          <w:tcPr>
-            <w:tcW w:w="2400" w:type="dxa"/>
-          </w:tcPr>
-          <w:p>
-            <w:r>
-              <w:lastRenderedPageBreak/>
+        <w:tc>
+          <w:tcPr>
+            <w:tcW w:w="2400" w:type="dxa"/>
+          </w:tcPr>
+          <w:p>
+            <w:r>
               <w:t>Supporting Documents</w:t>
             </w:r>
           </w:p>
@@ -7671,14 +7077,6 @@
         </w:tc>
       </w:tr>
       <w:tr>
-        <w:tblPrEx>
-          <w:tblCellMar>
-            <w:top w:w="0" w:type="dxa"/>
-            <w:left w:w="0" w:type="dxa"/>
-            <w:bottom w:w="0" w:type="dxa"/>
-            <w:right w:w="0" w:type="dxa"/>
-          </w:tblCellMar>
-        </w:tblPrEx>
         <w:tc>
           <w:tcPr>
             <w:tcW w:w="2400" w:type="dxa"/>
@@ -7713,14 +7111,6 @@
         </w:tc>
       </w:tr>
       <w:tr>
-        <w:tblPrEx>
-          <w:tblCellMar>
-            <w:top w:w="0" w:type="dxa"/>
-            <w:left w:w="0" w:type="dxa"/>
-            <w:bottom w:w="0" w:type="dxa"/>
-            <w:right w:w="0" w:type="dxa"/>
-          </w:tblCellMar>
-        </w:tblPrEx>
         <w:tc>
           <w:tcPr>
             <w:tcW w:w="2400" w:type="dxa"/>
@@ -7755,14 +7145,6 @@
         </w:tc>
       </w:tr>
       <w:tr>
-        <w:tblPrEx>
-          <w:tblCellMar>
-            <w:top w:w="0" w:type="dxa"/>
-            <w:left w:w="0" w:type="dxa"/>
-            <w:bottom w:w="0" w:type="dxa"/>
-            <w:right w:w="0" w:type="dxa"/>
-          </w:tblCellMar>
-        </w:tblPrEx>
         <w:tc>
           <w:tcPr>
             <w:tcW w:w="2400" w:type="dxa"/>
@@ -7797,14 +7179,6 @@
         </w:tc>
       </w:tr>
       <w:tr>
-        <w:tblPrEx>
-          <w:tblCellMar>
-            <w:top w:w="0" w:type="dxa"/>
-            <w:left w:w="0" w:type="dxa"/>
-            <w:bottom w:w="0" w:type="dxa"/>
-            <w:right w:w="0" w:type="dxa"/>
-          </w:tblCellMar>
-        </w:tblPrEx>
         <w:tc>
           <w:tcPr>
             <w:tcW w:w="2400" w:type="dxa"/>
@@ -7839,14 +7213,6 @@
         </w:tc>
       </w:tr>
       <w:tr>
-        <w:tblPrEx>
-          <w:tblCellMar>
-            <w:top w:w="0" w:type="dxa"/>
-            <w:left w:w="0" w:type="dxa"/>
-            <w:bottom w:w="0" w:type="dxa"/>
-            <w:right w:w="0" w:type="dxa"/>
-          </w:tblCellMar>
-        </w:tblPrEx>
         <w:tc>
           <w:tcPr>
             <w:tcW w:w="2400" w:type="dxa"/>
@@ -7881,20 +7247,13 @@
         </w:tc>
       </w:tr>
       <w:tr>
-        <w:tblPrEx>
-          <w:tblCellMar>
-            <w:top w:w="0" w:type="dxa"/>
-            <w:left w:w="0" w:type="dxa"/>
-            <w:bottom w:w="0" w:type="dxa"/>
-            <w:right w:w="0" w:type="dxa"/>
-          </w:tblCellMar>
-        </w:tblPrEx>
-        <w:tc>
-          <w:tcPr>
-            <w:tcW w:w="2400" w:type="dxa"/>
-          </w:tcPr>
-          <w:p>
-            <w:r>
+        <w:tc>
+          <w:tcPr>
+            <w:tcW w:w="2400" w:type="dxa"/>
+          </w:tcPr>
+          <w:p>
+            <w:r>
+              <w:lastRenderedPageBreak/>
               <w:t>Points Validation</w:t>
             </w:r>
           </w:p>
@@ -7923,14 +7282,6 @@
         </w:tc>
       </w:tr>
       <w:tr>
-        <w:tblPrEx>
-          <w:tblCellMar>
-            <w:top w:w="0" w:type="dxa"/>
-            <w:left w:w="0" w:type="dxa"/>
-            <w:bottom w:w="0" w:type="dxa"/>
-            <w:right w:w="0" w:type="dxa"/>
-          </w:tblCellMar>
-        </w:tblPrEx>
         <w:tc>
           <w:tcPr>
             <w:tcW w:w="2400" w:type="dxa"/>
@@ -7965,14 +7316,6 @@
         </w:tc>
       </w:tr>
       <w:tr>
-        <w:tblPrEx>
-          <w:tblCellMar>
-            <w:top w:w="0" w:type="dxa"/>
-            <w:left w:w="0" w:type="dxa"/>
-            <w:bottom w:w="0" w:type="dxa"/>
-            <w:right w:w="0" w:type="dxa"/>
-          </w:tblCellMar>
-        </w:tblPrEx>
         <w:tc>
           <w:tcPr>
             <w:tcW w:w="2400" w:type="dxa"/>
@@ -7989,15 +7332,7 @@
           </w:tcPr>
           <w:p>
             <w:r>
-              <w:t xml:space="preserve">Load Layers loads local output layers and </w:t>
-            </w:r>
-            <w:proofErr w:type="gramStart"/>
-            <w:r>
-              <w:t>zooms</w:t>
-            </w:r>
-            <w:proofErr w:type="gramEnd"/>
-            <w:r>
-              <w:t xml:space="preserve"> to parcel.</w:t>
+              <w:t>Load Layers loads local output layers and zooms to parcel.</w:t>
             </w:r>
           </w:p>
         </w:tc>
@@ -8015,14 +7350,6 @@
         </w:tc>
       </w:tr>
       <w:tr>
-        <w:tblPrEx>
-          <w:tblCellMar>
-            <w:top w:w="0" w:type="dxa"/>
-            <w:left w:w="0" w:type="dxa"/>
-            <w:bottom w:w="0" w:type="dxa"/>
-            <w:right w:w="0" w:type="dxa"/>
-          </w:tblCellMar>
-        </w:tblPrEx>
         <w:tc>
           <w:tcPr>
             <w:tcW w:w="2400" w:type="dxa"/>
@@ -8057,14 +7384,6 @@
         </w:tc>
       </w:tr>
       <w:tr>
-        <w:tblPrEx>
-          <w:tblCellMar>
-            <w:top w:w="0" w:type="dxa"/>
-            <w:left w:w="0" w:type="dxa"/>
-            <w:bottom w:w="0" w:type="dxa"/>
-            <w:right w:w="0" w:type="dxa"/>
-          </w:tblCellMar>
-        </w:tblPrEx>
         <w:tc>
           <w:tcPr>
             <w:tcW w:w="2400" w:type="dxa"/>
@@ -8099,14 +7418,6 @@
         </w:tc>
       </w:tr>
       <w:tr>
-        <w:tblPrEx>
-          <w:tblCellMar>
-            <w:top w:w="0" w:type="dxa"/>
-            <w:left w:w="0" w:type="dxa"/>
-            <w:bottom w:w="0" w:type="dxa"/>
-            <w:right w:w="0" w:type="dxa"/>
-          </w:tblCellMar>
-        </w:tblPrEx>
         <w:tc>
           <w:tcPr>
             <w:tcW w:w="2400" w:type="dxa"/>
@@ -8123,15 +7434,7 @@
           </w:tcPr>
           <w:p>
             <w:r>
-              <w:t xml:space="preserve">Name, PID, Volume/Folio, and </w:t>
-            </w:r>
-            <w:proofErr w:type="spellStart"/>
-            <w:r>
-              <w:t>LandVal</w:t>
-            </w:r>
-            <w:proofErr w:type="spellEnd"/>
-            <w:r>
-              <w:t xml:space="preserve"> searches work as expected.</w:t>
+              <w:t>Name, PID, Volume/Folio, and LandVal searches work as expected.</w:t>
             </w:r>
           </w:p>
         </w:tc>
@@ -8149,14 +7452,6 @@
         </w:tc>
       </w:tr>
       <w:tr>
-        <w:tblPrEx>
-          <w:tblCellMar>
-            <w:top w:w="0" w:type="dxa"/>
-            <w:left w:w="0" w:type="dxa"/>
-            <w:bottom w:w="0" w:type="dxa"/>
-            <w:right w:w="0" w:type="dxa"/>
-          </w:tblCellMar>
-        </w:tblPrEx>
         <w:tc>
           <w:tcPr>
             <w:tcW w:w="2400" w:type="dxa"/>
@@ -8191,14 +7486,6 @@
         </w:tc>
       </w:tr>
       <w:tr>
-        <w:tblPrEx>
-          <w:tblCellMar>
-            <w:top w:w="0" w:type="dxa"/>
-            <w:left w:w="0" w:type="dxa"/>
-            <w:bottom w:w="0" w:type="dxa"/>
-            <w:right w:w="0" w:type="dxa"/>
-          </w:tblCellMar>
-        </w:tblPrEx>
         <w:tc>
           <w:tcPr>
             <w:tcW w:w="2400" w:type="dxa"/>
@@ -8215,15 +7502,7 @@
           </w:tcPr>
           <w:p>
             <w:r>
-              <w:t xml:space="preserve">Successful </w:t>
-            </w:r>
-            <w:proofErr w:type="gramStart"/>
-            <w:r>
-              <w:t>finalize</w:t>
-            </w:r>
-            <w:proofErr w:type="gramEnd"/>
-            <w:r>
-              <w:t xml:space="preserve"> shows a completion dialog and moves the task forward.</w:t>
+              <w:t>Successful finalize shows a completion dialog and moves the task forward.</w:t>
             </w:r>
           </w:p>
         </w:tc>
@@ -8241,21 +7520,12 @@
         </w:tc>
       </w:tr>
       <w:tr>
-        <w:tblPrEx>
-          <w:tblCellMar>
-            <w:top w:w="0" w:type="dxa"/>
-            <w:left w:w="0" w:type="dxa"/>
-            <w:bottom w:w="0" w:type="dxa"/>
-            <w:right w:w="0" w:type="dxa"/>
-          </w:tblCellMar>
-        </w:tblPrEx>
-        <w:tc>
-          <w:tcPr>
-            <w:tcW w:w="2400" w:type="dxa"/>
-          </w:tcPr>
-          <w:p>
-            <w:r>
-              <w:lastRenderedPageBreak/>
+        <w:tc>
+          <w:tcPr>
+            <w:tcW w:w="2400" w:type="dxa"/>
+          </w:tcPr>
+          <w:p>
+            <w:r>
               <w:t>Cleanup</w:t>
             </w:r>
           </w:p>
@@ -8284,14 +7554,6 @@
         </w:tc>
       </w:tr>
       <w:tr>
-        <w:tblPrEx>
-          <w:tblCellMar>
-            <w:top w:w="0" w:type="dxa"/>
-            <w:left w:w="0" w:type="dxa"/>
-            <w:bottom w:w="0" w:type="dxa"/>
-            <w:right w:w="0" w:type="dxa"/>
-          </w:tblCellMar>
-        </w:tblPrEx>
         <w:tc>
           <w:tcPr>
             <w:tcW w:w="2400" w:type="dxa"/>
@@ -8308,15 +7570,7 @@
           </w:tcPr>
           <w:p>
             <w:r>
-              <w:t xml:space="preserve">Logs and installation </w:t>
-            </w:r>
-            <w:proofErr w:type="gramStart"/>
-            <w:r>
-              <w:t>summary</w:t>
-            </w:r>
-            <w:proofErr w:type="gramEnd"/>
-            <w:r>
-              <w:t xml:space="preserve"> are created.</w:t>
+              <w:t>Logs and installation summary are created.</w:t>
             </w:r>
           </w:p>
         </w:tc>
@@ -8367,13 +7621,8 @@
       <w:pPr>
         <w:pStyle w:val="ListParagraph"/>
       </w:pPr>
-      <w:proofErr w:type="gramStart"/>
-      <w:r>
-        <w:t>User name</w:t>
-      </w:r>
-      <w:proofErr w:type="gramEnd"/>
-      <w:r>
-        <w:t xml:space="preserve"> and password.</w:t>
+      <w:r>
+        <w:t>User name and password.</w:t>
       </w:r>
     </w:p>
     <w:p>
@@ -8389,31 +7638,15 @@
         <w:pStyle w:val="ListParagraph"/>
       </w:pPr>
       <w:r>
-        <w:t xml:space="preserve">Network access to the </w:t>
-      </w:r>
-      <w:proofErr w:type="spellStart"/>
-      <w:r>
-        <w:t>Innola</w:t>
-      </w:r>
-      <w:proofErr w:type="spellEnd"/>
-      <w:r>
-        <w:t xml:space="preserve"> server.</w:t>
-      </w:r>
-    </w:p>
-    <w:p>
-      <w:pPr>
-        <w:pStyle w:val="ListParagraph"/>
-      </w:pPr>
-      <w:r>
-        <w:t xml:space="preserve">Whether the </w:t>
-      </w:r>
-      <w:proofErr w:type="spellStart"/>
-      <w:r>
-        <w:t>Innola</w:t>
-      </w:r>
-      <w:proofErr w:type="spellEnd"/>
-      <w:r>
-        <w:t xml:space="preserve"> session expired.</w:t>
+        <w:t>Network access to the Innola server.</w:t>
+      </w:r>
+    </w:p>
+    <w:p>
+      <w:pPr>
+        <w:pStyle w:val="ListParagraph"/>
+      </w:pPr>
+      <w:r>
+        <w:t>Whether the Innola session expired.</w:t>
       </w:r>
     </w:p>
     <w:p/>
@@ -8534,6 +7767,7 @@
         <w:pStyle w:val="ListParagraph"/>
       </w:pPr>
       <w:r>
+        <w:lastRenderedPageBreak/>
         <w:t>PDF is not locked or deleted.</w:t>
       </w:r>
     </w:p>
@@ -8619,13 +7853,8 @@
         <w:pStyle w:val="Heading2"/>
       </w:pPr>
       <w:bookmarkStart w:id="29" w:name="_Toc236825269"/>
-      <w:proofErr w:type="spellStart"/>
-      <w:r>
-        <w:t>ArcPy</w:t>
-      </w:r>
-      <w:proofErr w:type="spellEnd"/>
-      <w:r>
-        <w:t xml:space="preserve"> Is Not Available</w:t>
+      <w:r>
+        <w:t>ArcPy Is Not Available</w:t>
       </w:r>
       <w:bookmarkEnd w:id="29"/>
     </w:p>
@@ -8664,14 +7893,8 @@
       <w:pPr>
         <w:pStyle w:val="ListParagraph"/>
       </w:pPr>
-      <w:proofErr w:type="spellStart"/>
-      <w:r>
-        <w:lastRenderedPageBreak/>
-        <w:t>ArcPy</w:t>
-      </w:r>
-      <w:proofErr w:type="spellEnd"/>
-      <w:r>
-        <w:t xml:space="preserve"> can be imported inside the active ArcGIS Pro session.</w:t>
+      <w:r>
+        <w:t>ArcPy can be imported inside the active ArcGIS Pro session.</w:t>
       </w:r>
     </w:p>
     <w:p/>
@@ -8686,37 +7909,7 @@
         <w:rPr>
           <w:rStyle w:val="CodeChar"/>
         </w:rPr>
-        <w:t xml:space="preserve">python -c "import </w:t>
-      </w:r>
-      <w:proofErr w:type="spellStart"/>
-      <w:r>
-        <w:rPr>
-          <w:rStyle w:val="CodeChar"/>
-        </w:rPr>
-        <w:t>arcpy</w:t>
-      </w:r>
-      <w:proofErr w:type="spellEnd"/>
-      <w:r>
-        <w:rPr>
-          <w:rStyle w:val="CodeChar"/>
-        </w:rPr>
-        <w:t>; print(</w:t>
-      </w:r>
-      <w:proofErr w:type="spellStart"/>
-      <w:proofErr w:type="gramStart"/>
-      <w:r>
-        <w:rPr>
-          <w:rStyle w:val="CodeChar"/>
-        </w:rPr>
-        <w:t>arcpy.GetInstallInfo</w:t>
-      </w:r>
-      <w:proofErr w:type="spellEnd"/>
-      <w:proofErr w:type="gramEnd"/>
-      <w:r>
-        <w:rPr>
-          <w:rStyle w:val="CodeChar"/>
-        </w:rPr>
-        <w:t>())"</w:t>
+        <w:t>python -c "import arcpy; print(arcpy.GetInstallInfo())"</w:t>
       </w:r>
     </w:p>
     <w:p/>
@@ -8733,15 +7926,7 @@
     <w:p/>
     <w:p>
       <w:r>
-        <w:t xml:space="preserve">This can happen when </w:t>
-      </w:r>
-      <w:proofErr w:type="spellStart"/>
-      <w:r>
-        <w:t>ArcPy</w:t>
-      </w:r>
-      <w:proofErr w:type="spellEnd"/>
-      <w:r>
-        <w:t xml:space="preserve"> is started outside a licensed ArcGIS Pro session or from an elevated/service context that cannot access the named-user license.</w:t>
+        <w:t>This can happen when ArcPy is started outside a licensed ArcGIS Pro session or from an elevated/service context that cannot access the named-user license.</w:t>
       </w:r>
     </w:p>
     <w:p/>
@@ -8835,51 +8020,7 @@
         <w:rPr>
           <w:rStyle w:val="CodeChar"/>
         </w:rPr>
-        <w:t xml:space="preserve">python -c "import </w:t>
-      </w:r>
-      <w:proofErr w:type="spellStart"/>
-      <w:r>
-        <w:rPr>
-          <w:rStyle w:val="CodeChar"/>
-        </w:rPr>
-        <w:t>os</w:t>
-      </w:r>
-      <w:proofErr w:type="spellEnd"/>
-      <w:r>
-        <w:rPr>
-          <w:rStyle w:val="CodeChar"/>
-        </w:rPr>
-        <w:t>; print(bool(</w:t>
-      </w:r>
-      <w:proofErr w:type="spellStart"/>
-      <w:proofErr w:type="gramStart"/>
-      <w:r>
-        <w:rPr>
-          <w:rStyle w:val="CodeChar"/>
-        </w:rPr>
-        <w:t>os.getenv</w:t>
-      </w:r>
-      <w:proofErr w:type="spellEnd"/>
-      <w:proofErr w:type="gramEnd"/>
-      <w:r>
-        <w:rPr>
-          <w:rStyle w:val="CodeChar"/>
-        </w:rPr>
-        <w:t>('OPENAI_API_</w:t>
-      </w:r>
-      <w:proofErr w:type="gramStart"/>
-      <w:r>
-        <w:rPr>
-          <w:rStyle w:val="CodeChar"/>
-        </w:rPr>
-        <w:t>KEY')</w:t>
-      </w:r>
-      <w:proofErr w:type="gramEnd"/>
-      <w:r>
-        <w:rPr>
-          <w:rStyle w:val="CodeChar"/>
-        </w:rPr>
-        <w:t>))"</w:t>
+        <w:t>python -c "import os; print(bool(os.getenv('OPENAI_API_KEY')))"</w:t>
       </w:r>
     </w:p>
     <w:p/>
@@ -8888,20 +8029,14 @@
         <w:pStyle w:val="Heading2"/>
       </w:pPr>
       <w:bookmarkStart w:id="32" w:name="_Toc236825272"/>
-      <w:proofErr w:type="spellStart"/>
-      <w:r>
-        <w:t>Georeference</w:t>
-      </w:r>
-      <w:proofErr w:type="spellEnd"/>
-      <w:r>
-        <w:t xml:space="preserve"> Check Blocked</w:t>
+      <w:r>
+        <w:t>Georeference Check Blocked</w:t>
       </w:r>
       <w:bookmarkEnd w:id="32"/>
     </w:p>
     <w:p/>
     <w:p>
       <w:r>
-        <w:lastRenderedPageBreak/>
         <w:t>What to check:</w:t>
       </w:r>
     </w:p>
@@ -9011,15 +8146,7 @@
         <w:pStyle w:val="ListParagraph"/>
       </w:pPr>
       <w:r>
-        <w:t xml:space="preserve">Validate Points and Lines </w:t>
-      </w:r>
-      <w:proofErr w:type="gramStart"/>
-      <w:r>
-        <w:t>is</w:t>
-      </w:r>
-      <w:proofErr w:type="gramEnd"/>
-      <w:r>
-        <w:t xml:space="preserve"> completed.</w:t>
+        <w:t>Validate Points and Lines is completed.</w:t>
       </w:r>
     </w:p>
     <w:p>
@@ -9042,13 +8169,8 @@
       <w:pPr>
         <w:pStyle w:val="ListParagraph"/>
       </w:pPr>
-      <w:proofErr w:type="spellStart"/>
-      <w:r>
-        <w:t>Innola</w:t>
-      </w:r>
-      <w:proofErr w:type="spellEnd"/>
-      <w:r>
-        <w:t xml:space="preserve"> login/session is still valid if final upload is required.</w:t>
+      <w:r>
+        <w:t>Innola login/session is still valid if final upload is required.</w:t>
       </w:r>
     </w:p>
     <w:p/>
@@ -9073,30 +8195,16 @@
       <w:pPr>
         <w:pStyle w:val="ListParagraph"/>
       </w:pPr>
-      <w:proofErr w:type="spellStart"/>
-      <w:r>
-        <w:t>Innola</w:t>
-      </w:r>
-      <w:proofErr w:type="spellEnd"/>
-      <w:r>
-        <w:t xml:space="preserve"> session is still valid.</w:t>
-      </w:r>
-    </w:p>
-    <w:p>
-      <w:pPr>
-        <w:pStyle w:val="ListParagraph"/>
-      </w:pPr>
-      <w:r>
-        <w:lastRenderedPageBreak/>
-        <w:t xml:space="preserve">Search field is correct: Name, PID, Volume/Folio, or </w:t>
-      </w:r>
-      <w:proofErr w:type="spellStart"/>
-      <w:r>
-        <w:t>LandVal</w:t>
-      </w:r>
-      <w:proofErr w:type="spellEnd"/>
-      <w:r>
-        <w:t>.</w:t>
+      <w:r>
+        <w:t>Innola session is still valid.</w:t>
+      </w:r>
+    </w:p>
+    <w:p>
+      <w:pPr>
+        <w:pStyle w:val="ListParagraph"/>
+      </w:pPr>
+      <w:r>
+        <w:t>Search field is correct: Name, PID, Volume/Folio, or LandVal.</w:t>
       </w:r>
     </w:p>
     <w:p>
@@ -9255,19 +8363,11 @@
       <w:pPr>
         <w:pStyle w:val="ListParagraph"/>
       </w:pPr>
-      <w:proofErr w:type="gramStart"/>
       <w:r>
         <w:rPr>
           <w:rStyle w:val="CodeChar"/>
         </w:rPr>
-        <w:t>C:\Sidwell\ParcelWorkflow\ParcelWorkflowCases\</w:t>
-      </w:r>
-      <w:proofErr w:type="gramEnd"/>
-      <w:r>
-        <w:rPr>
-          <w:rStyle w:val="CodeChar"/>
-        </w:rPr>
-        <w:t>&lt;transaction&gt;\output</w:t>
+        <w:t>C:\Sidwell\ParcelWorkflow\ParcelWorkflowCases\&lt;transaction&gt;\output</w:t>
       </w:r>
     </w:p>
     <w:p>
@@ -9303,41 +8403,23 @@
       <w:pPr>
         <w:pStyle w:val="ListParagraph"/>
       </w:pPr>
-      <w:proofErr w:type="spellStart"/>
       <w:r>
         <w:rPr>
           <w:rStyle w:val="CodeChar"/>
         </w:rPr>
-        <w:t>installation_</w:t>
-      </w:r>
-      <w:proofErr w:type="gramStart"/>
+        <w:t>installation_summary.json</w:t>
+      </w:r>
+    </w:p>
+    <w:p>
+      <w:pPr>
+        <w:pStyle w:val="ListParagraph"/>
+      </w:pPr>
       <w:r>
         <w:rPr>
           <w:rStyle w:val="CodeChar"/>
         </w:rPr>
-        <w:t>summary.json</w:t>
-      </w:r>
-      <w:proofErr w:type="spellEnd"/>
-      <w:proofErr w:type="gramEnd"/>
-    </w:p>
-    <w:p>
-      <w:pPr>
-        <w:pStyle w:val="ListParagraph"/>
-      </w:pPr>
-      <w:r>
-        <w:rPr>
-          <w:rStyle w:val="CodeChar"/>
-        </w:rPr>
-        <w:t>setup_arcgispro37_environment_</w:t>
-      </w:r>
-      <w:proofErr w:type="gramStart"/>
-      <w:r>
-        <w:rPr>
-          <w:rStyle w:val="CodeChar"/>
-        </w:rPr>
-        <w:t>status.json</w:t>
-      </w:r>
-      <w:proofErr w:type="gramEnd"/>
+        <w:t>setup_arcgispro37_environment_status.json</w:t>
+      </w:r>
     </w:p>
     <w:p>
       <w:pPr>
@@ -9384,15 +8466,7 @@
         <w:pStyle w:val="ListParagraph"/>
       </w:pPr>
       <w:r>
-        <w:t xml:space="preserve">All generated parcel geometry must </w:t>
-      </w:r>
-      <w:proofErr w:type="gramStart"/>
-      <w:r>
-        <w:t>use</w:t>
-      </w:r>
-      <w:proofErr w:type="gramEnd"/>
-      <w:r>
-        <w:t xml:space="preserve"> JAD2001 / EPSG:3448.</w:t>
+        <w:t>All generated parcel geometry must use JAD2001 / EPSG:3448.</w:t>
       </w:r>
     </w:p>
     <w:p>
@@ -9415,39 +8489,24 @@
         <w:pStyle w:val="ListParagraph"/>
       </w:pPr>
       <w:r>
-        <w:t xml:space="preserve">Legal </w:t>
-      </w:r>
-      <w:proofErr w:type="spellStart"/>
-      <w:r>
-        <w:t>Cadastre</w:t>
-      </w:r>
-      <w:proofErr w:type="spellEnd"/>
-    </w:p>
-    <w:p>
-      <w:pPr>
-        <w:pStyle w:val="ListParagraph"/>
-      </w:pPr>
-      <w:r>
-        <w:t xml:space="preserve">Fiscal </w:t>
-      </w:r>
-      <w:proofErr w:type="spellStart"/>
-      <w:r>
-        <w:t>Cadastre</w:t>
-      </w:r>
-      <w:proofErr w:type="spellEnd"/>
-    </w:p>
-    <w:p>
-      <w:pPr>
-        <w:pStyle w:val="ListParagraph"/>
-      </w:pPr>
-      <w:r>
-        <w:t xml:space="preserve">Survey </w:t>
-      </w:r>
-      <w:proofErr w:type="spellStart"/>
-      <w:r>
-        <w:t>Cadastre</w:t>
-      </w:r>
-      <w:proofErr w:type="spellEnd"/>
+        <w:t>Legal Cadastre</w:t>
+      </w:r>
+    </w:p>
+    <w:p>
+      <w:pPr>
+        <w:pStyle w:val="ListParagraph"/>
+      </w:pPr>
+      <w:r>
+        <w:t>Fiscal Cadastre</w:t>
+      </w:r>
+    </w:p>
+    <w:p>
+      <w:pPr>
+        <w:pStyle w:val="ListParagraph"/>
+      </w:pPr>
+      <w:r>
+        <w:t>Survey Cadastre</w:t>
+      </w:r>
     </w:p>
     <w:p>
       <w:pPr>
@@ -9478,13 +8537,8 @@
         <w:pStyle w:val="ListParagraph"/>
       </w:pPr>
       <w:r>
-        <w:t xml:space="preserve">World </w:t>
-      </w:r>
-      <w:proofErr w:type="spellStart"/>
-      <w:r>
-        <w:t>Hillshade</w:t>
-      </w:r>
-      <w:proofErr w:type="spellEnd"/>
+        <w:t>World Hillshade</w:t>
+      </w:r>
     </w:p>
     <w:p/>
     <w:p>
@@ -9544,12 +8598,6 @@
         <w:tblStyle w:val="TableGrid"/>
         <w:tblW w:w="0" w:type="auto"/>
         <w:tblInd w:w="5" w:type="dxa"/>
-        <w:tblCellMar>
-          <w:top w:w="0" w:type="dxa"/>
-          <w:left w:w="0" w:type="dxa"/>
-          <w:bottom w:w="0" w:type="dxa"/>
-          <w:right w:w="0" w:type="dxa"/>
-        </w:tblCellMar>
         <w:tblLook w:val="04A0" w:firstRow="1" w:lastRow="0" w:firstColumn="1" w:lastColumn="0" w:noHBand="0" w:noVBand="1"/>
       </w:tblPr>
       <w:tblGrid>
@@ -9558,14 +8606,6 @@
         <w:gridCol w:w="2400"/>
       </w:tblGrid>
       <w:tr>
-        <w:tblPrEx>
-          <w:tblCellMar>
-            <w:top w:w="0" w:type="dxa"/>
-            <w:left w:w="0" w:type="dxa"/>
-            <w:bottom w:w="0" w:type="dxa"/>
-            <w:right w:w="0" w:type="dxa"/>
-          </w:tblCellMar>
-        </w:tblPrEx>
         <w:tc>
           <w:tcPr>
             <w:tcW w:w="2400" w:type="dxa"/>
@@ -9607,14 +8647,6 @@
         </w:tc>
       </w:tr>
       <w:tr>
-        <w:tblPrEx>
-          <w:tblCellMar>
-            <w:top w:w="0" w:type="dxa"/>
-            <w:left w:w="0" w:type="dxa"/>
-            <w:bottom w:w="0" w:type="dxa"/>
-            <w:right w:w="0" w:type="dxa"/>
-          </w:tblCellMar>
-        </w:tblPrEx>
         <w:tc>
           <w:tcPr>
             <w:tcW w:w="2400" w:type="dxa"/>
@@ -9643,14 +8675,6 @@
         </w:tc>
       </w:tr>
       <w:tr>
-        <w:tblPrEx>
-          <w:tblCellMar>
-            <w:top w:w="0" w:type="dxa"/>
-            <w:left w:w="0" w:type="dxa"/>
-            <w:bottom w:w="0" w:type="dxa"/>
-            <w:right w:w="0" w:type="dxa"/>
-          </w:tblCellMar>
-        </w:tblPrEx>
         <w:tc>
           <w:tcPr>
             <w:tcW w:w="2400" w:type="dxa"/>
@@ -9679,20 +8703,13 @@
         </w:tc>
       </w:tr>
       <w:tr>
-        <w:tblPrEx>
-          <w:tblCellMar>
-            <w:top w:w="0" w:type="dxa"/>
-            <w:left w:w="0" w:type="dxa"/>
-            <w:bottom w:w="0" w:type="dxa"/>
-            <w:right w:w="0" w:type="dxa"/>
-          </w:tblCellMar>
-        </w:tblPrEx>
-        <w:tc>
-          <w:tcPr>
-            <w:tcW w:w="2400" w:type="dxa"/>
-          </w:tcPr>
-          <w:p>
-            <w:r>
+        <w:tc>
+          <w:tcPr>
+            <w:tcW w:w="2400" w:type="dxa"/>
+          </w:tcPr>
+          <w:p>
+            <w:r>
+              <w:lastRenderedPageBreak/>
               <w:t>`03-transaction-info.png`</w:t>
             </w:r>
           </w:p>
@@ -9715,14 +8732,6 @@
         </w:tc>
       </w:tr>
       <w:tr>
-        <w:tblPrEx>
-          <w:tblCellMar>
-            <w:top w:w="0" w:type="dxa"/>
-            <w:left w:w="0" w:type="dxa"/>
-            <w:bottom w:w="0" w:type="dxa"/>
-            <w:right w:w="0" w:type="dxa"/>
-          </w:tblCellMar>
-        </w:tblPrEx>
         <w:tc>
           <w:tcPr>
             <w:tcW w:w="2400" w:type="dxa"/>
@@ -9751,14 +8760,6 @@
         </w:tc>
       </w:tr>
       <w:tr>
-        <w:tblPrEx>
-          <w:tblCellMar>
-            <w:top w:w="0" w:type="dxa"/>
-            <w:left w:w="0" w:type="dxa"/>
-            <w:bottom w:w="0" w:type="dxa"/>
-            <w:right w:w="0" w:type="dxa"/>
-          </w:tblCellMar>
-        </w:tblPrEx>
         <w:tc>
           <w:tcPr>
             <w:tcW w:w="2400" w:type="dxa"/>
@@ -9787,14 +8788,6 @@
         </w:tc>
       </w:tr>
       <w:tr>
-        <w:tblPrEx>
-          <w:tblCellMar>
-            <w:top w:w="0" w:type="dxa"/>
-            <w:left w:w="0" w:type="dxa"/>
-            <w:bottom w:w="0" w:type="dxa"/>
-            <w:right w:w="0" w:type="dxa"/>
-          </w:tblCellMar>
-        </w:tblPrEx>
         <w:tc>
           <w:tcPr>
             <w:tcW w:w="2400" w:type="dxa"/>
@@ -9823,14 +8816,6 @@
         </w:tc>
       </w:tr>
       <w:tr>
-        <w:tblPrEx>
-          <w:tblCellMar>
-            <w:top w:w="0" w:type="dxa"/>
-            <w:left w:w="0" w:type="dxa"/>
-            <w:bottom w:w="0" w:type="dxa"/>
-            <w:right w:w="0" w:type="dxa"/>
-          </w:tblCellMar>
-        </w:tblPrEx>
         <w:tc>
           <w:tcPr>
             <w:tcW w:w="2400" w:type="dxa"/>
@@ -9859,14 +8844,6 @@
         </w:tc>
       </w:tr>
       <w:tr>
-        <w:tblPrEx>
-          <w:tblCellMar>
-            <w:top w:w="0" w:type="dxa"/>
-            <w:left w:w="0" w:type="dxa"/>
-            <w:bottom w:w="0" w:type="dxa"/>
-            <w:right w:w="0" w:type="dxa"/>
-          </w:tblCellMar>
-        </w:tblPrEx>
         <w:tc>
           <w:tcPr>
             <w:tcW w:w="2400" w:type="dxa"/>
@@ -9895,14 +8872,6 @@
         </w:tc>
       </w:tr>
       <w:tr>
-        <w:tblPrEx>
-          <w:tblCellMar>
-            <w:top w:w="0" w:type="dxa"/>
-            <w:left w:w="0" w:type="dxa"/>
-            <w:bottom w:w="0" w:type="dxa"/>
-            <w:right w:w="0" w:type="dxa"/>
-          </w:tblCellMar>
-        </w:tblPrEx>
         <w:tc>
           <w:tcPr>
             <w:tcW w:w="2400" w:type="dxa"/>
@@ -9931,14 +8900,6 @@
         </w:tc>
       </w:tr>
       <w:tr>
-        <w:tblPrEx>
-          <w:tblCellMar>
-            <w:top w:w="0" w:type="dxa"/>
-            <w:left w:w="0" w:type="dxa"/>
-            <w:bottom w:w="0" w:type="dxa"/>
-            <w:right w:w="0" w:type="dxa"/>
-          </w:tblCellMar>
-        </w:tblPrEx>
         <w:tc>
           <w:tcPr>
             <w:tcW w:w="2400" w:type="dxa"/>
@@ -9967,14 +8928,6 @@
         </w:tc>
       </w:tr>
       <w:tr>
-        <w:tblPrEx>
-          <w:tblCellMar>
-            <w:top w:w="0" w:type="dxa"/>
-            <w:left w:w="0" w:type="dxa"/>
-            <w:bottom w:w="0" w:type="dxa"/>
-            <w:right w:w="0" w:type="dxa"/>
-          </w:tblCellMar>
-        </w:tblPrEx>
         <w:tc>
           <w:tcPr>
             <w:tcW w:w="2400" w:type="dxa"/>
@@ -10003,14 +8956,6 @@
         </w:tc>
       </w:tr>
       <w:tr>
-        <w:tblPrEx>
-          <w:tblCellMar>
-            <w:top w:w="0" w:type="dxa"/>
-            <w:left w:w="0" w:type="dxa"/>
-            <w:bottom w:w="0" w:type="dxa"/>
-            <w:right w:w="0" w:type="dxa"/>
-          </w:tblCellMar>
-        </w:tblPrEx>
         <w:tc>
           <w:tcPr>
             <w:tcW w:w="2400" w:type="dxa"/>
@@ -10039,14 +8984,6 @@
         </w:tc>
       </w:tr>
       <w:tr>
-        <w:tblPrEx>
-          <w:tblCellMar>
-            <w:top w:w="0" w:type="dxa"/>
-            <w:left w:w="0" w:type="dxa"/>
-            <w:bottom w:w="0" w:type="dxa"/>
-            <w:right w:w="0" w:type="dxa"/>
-          </w:tblCellMar>
-        </w:tblPrEx>
         <w:tc>
           <w:tcPr>
             <w:tcW w:w="2400" w:type="dxa"/>
@@ -10075,14 +9012,6 @@
         </w:tc>
       </w:tr>
       <w:tr>
-        <w:tblPrEx>
-          <w:tblCellMar>
-            <w:top w:w="0" w:type="dxa"/>
-            <w:left w:w="0" w:type="dxa"/>
-            <w:bottom w:w="0" w:type="dxa"/>
-            <w:right w:w="0" w:type="dxa"/>
-          </w:tblCellMar>
-        </w:tblPrEx>
         <w:tc>
           <w:tcPr>
             <w:tcW w:w="2400" w:type="dxa"/>
@@ -10099,15 +9028,7 @@
           </w:tcPr>
           <w:p>
             <w:r>
-              <w:t xml:space="preserve">Search results from </w:t>
-            </w:r>
-            <w:proofErr w:type="spellStart"/>
-            <w:r>
-              <w:t>Innola</w:t>
-            </w:r>
-            <w:proofErr w:type="spellEnd"/>
-            <w:r>
-              <w:t>.</w:t>
+              <w:t>Search results from Innola.</w:t>
             </w:r>
           </w:p>
         </w:tc>
@@ -10119,40 +9040,23 @@
         </w:tc>
       </w:tr>
       <w:tr>
-        <w:tblPrEx>
-          <w:tblCellMar>
-            <w:top w:w="0" w:type="dxa"/>
-            <w:left w:w="0" w:type="dxa"/>
-            <w:bottom w:w="0" w:type="dxa"/>
-            <w:right w:w="0" w:type="dxa"/>
-          </w:tblCellMar>
-        </w:tblPrEx>
-        <w:tc>
-          <w:tcPr>
-            <w:tcW w:w="2400" w:type="dxa"/>
-          </w:tcPr>
-          <w:p>
-            <w:r>
-              <w:t>`14-finalize-</w:t>
-            </w:r>
-            <w:r>
-              <w:lastRenderedPageBreak/>
-              <w:t>complete.png`</w:t>
-            </w:r>
-          </w:p>
-        </w:tc>
-        <w:tc>
-          <w:tcPr>
-            <w:tcW w:w="2400" w:type="dxa"/>
-          </w:tcPr>
-          <w:p>
-            <w:r>
-              <w:lastRenderedPageBreak/>
-              <w:t xml:space="preserve">Completion confirmation </w:t>
-            </w:r>
-            <w:r>
-              <w:lastRenderedPageBreak/>
-              <w:t>dialog.</w:t>
+        <w:tc>
+          <w:tcPr>
+            <w:tcW w:w="2400" w:type="dxa"/>
+          </w:tcPr>
+          <w:p>
+            <w:r>
+              <w:t>`14-finalize-complete.png`</w:t>
+            </w:r>
+          </w:p>
+        </w:tc>
+        <w:tc>
+          <w:tcPr>
+            <w:tcW w:w="2400" w:type="dxa"/>
+          </w:tcPr>
+          <w:p>
+            <w:r>
+              <w:t>Completion confirmation dialog.</w:t>
             </w:r>
           </w:p>
         </w:tc>
@@ -10181,12 +9085,6 @@
         <w:tblStyle w:val="TableGrid"/>
         <w:tblW w:w="0" w:type="auto"/>
         <w:tblInd w:w="5" w:type="dxa"/>
-        <w:tblCellMar>
-          <w:top w:w="0" w:type="dxa"/>
-          <w:left w:w="0" w:type="dxa"/>
-          <w:bottom w:w="0" w:type="dxa"/>
-          <w:right w:w="0" w:type="dxa"/>
-        </w:tblCellMar>
         <w:tblLook w:val="04A0" w:firstRow="1" w:lastRow="0" w:firstColumn="1" w:lastColumn="0" w:noHBand="0" w:noVBand="1"/>
       </w:tblPr>
       <w:tblGrid>
@@ -10197,14 +9095,6 @@
         <w:gridCol w:w="2125"/>
       </w:tblGrid>
       <w:tr>
-        <w:tblPrEx>
-          <w:tblCellMar>
-            <w:top w:w="0" w:type="dxa"/>
-            <w:left w:w="0" w:type="dxa"/>
-            <w:bottom w:w="0" w:type="dxa"/>
-            <w:right w:w="0" w:type="dxa"/>
-          </w:tblCellMar>
-        </w:tblPrEx>
         <w:tc>
           <w:tcPr>
             <w:tcW w:w="2400" w:type="dxa"/>
@@ -10272,14 +9162,6 @@
         </w:tc>
       </w:tr>
       <w:tr>
-        <w:tblPrEx>
-          <w:tblCellMar>
-            <w:top w:w="0" w:type="dxa"/>
-            <w:left w:w="0" w:type="dxa"/>
-            <w:bottom w:w="0" w:type="dxa"/>
-            <w:right w:w="0" w:type="dxa"/>
-          </w:tblCellMar>
-        </w:tblPrEx>
         <w:tc>
           <w:tcPr>
             <w:tcW w:w="2400" w:type="dxa"/>
@@ -10316,14 +9198,6 @@
         </w:tc>
       </w:tr>
       <w:tr>
-        <w:tblPrEx>
-          <w:tblCellMar>
-            <w:top w:w="0" w:type="dxa"/>
-            <w:left w:w="0" w:type="dxa"/>
-            <w:bottom w:w="0" w:type="dxa"/>
-            <w:right w:w="0" w:type="dxa"/>
-          </w:tblCellMar>
-        </w:tblPrEx>
         <w:tc>
           <w:tcPr>
             <w:tcW w:w="2400" w:type="dxa"/>
@@ -10360,14 +9234,6 @@
         </w:tc>
       </w:tr>
       <w:tr>
-        <w:tblPrEx>
-          <w:tblCellMar>
-            <w:top w:w="0" w:type="dxa"/>
-            <w:left w:w="0" w:type="dxa"/>
-            <w:bottom w:w="0" w:type="dxa"/>
-            <w:right w:w="0" w:type="dxa"/>
-          </w:tblCellMar>
-        </w:tblPrEx>
         <w:tc>
           <w:tcPr>
             <w:tcW w:w="2400" w:type="dxa"/>
@@ -10404,14 +9270,6 @@
         </w:tc>
       </w:tr>
       <w:tr>
-        <w:tblPrEx>
-          <w:tblCellMar>
-            <w:top w:w="0" w:type="dxa"/>
-            <w:left w:w="0" w:type="dxa"/>
-            <w:bottom w:w="0" w:type="dxa"/>
-            <w:right w:w="0" w:type="dxa"/>
-          </w:tblCellMar>
-        </w:tblPrEx>
         <w:tc>
           <w:tcPr>
             <w:tcW w:w="2400" w:type="dxa"/>
@@ -10456,6 +9314,243 @@
     </w:sectPr>
   </w:body>
 </w:document>
+</file>
+
+<file path=word/numbering.xml><?xml version="1.0" encoding="utf-8"?>
+<w:numbering xmlns:wpc="http://schemas.microsoft.com/office/word/2010/wordprocessingCanvas" xmlns:cx="http://schemas.microsoft.com/office/drawing/2014/chartex" xmlns:cx1="http://schemas.microsoft.com/office/drawing/2015/9/8/chartex" xmlns:cx2="http://schemas.microsoft.com/office/drawing/2015/10/21/chartex" xmlns:cx3="http://schemas.microsoft.com/office/drawing/2016/5/9/chartex" xmlns:cx4="http://schemas.microsoft.com/office/drawing/2016/5/10/chartex" xmlns:cx5="http://schemas.microsoft.com/office/drawing/2016/5/11/chartex" xmlns:cx6="http://schemas.microsoft.com/office/drawing/2016/5/12/chartex" xmlns:cx7="http://schemas.microsoft.com/office/drawing/2016/5/13/chartex" xmlns:cx8="http://schemas.microsoft.com/office/drawing/2016/5/14/chartex" xmlns:mc="http://schemas.openxmlformats.org/markup-compatibility/2006" xmlns:aink="http://schemas.microsoft.com/office/drawing/2016/ink" xmlns:am3d="http://schemas.microsoft.com/office/drawing/2017/model3d" xmlns:o="urn:schemas-microsoft-com:office:office" xmlns:oel="http://schemas.microsoft.com/office/2019/extlst" xmlns:r="http://schemas.openxmlformats.org/officeDocument/2006/relationships" xmlns:m="http://schemas.openxmlformats.org/officeDocument/2006/math" xmlns:v="urn:schemas-microsoft-com:vml" xmlns:wp14="http://schemas.microsoft.com/office/word/2010/wordprocessingDrawing" xmlns:wp="http://schemas.openxmlformats.org/drawingml/2006/wordprocessingDrawing" xmlns:w10="urn:schemas-microsoft-com:office:word" xmlns:w="http://schemas.openxmlformats.org/wordprocessingml/2006/main" xmlns:w14="http://schemas.microsoft.com/office/word/2010/wordml" xmlns:w15="http://schemas.microsoft.com/office/word/2012/wordml" xmlns:w16cex="http://schemas.microsoft.com/office/word/2018/wordml/cex" xmlns:w16cid="http://schemas.microsoft.com/office/word/2016/wordml/cid" xmlns:w16="http://schemas.microsoft.com/office/word/2018/wordml" xmlns:w16du="http://schemas.microsoft.com/office/word/2023/wordml/word16du" xmlns:w16sdtdh="http://schemas.microsoft.com/office/word/2020/wordml/sdtdatahash" xmlns:w16sdtfl="http://schemas.microsoft.com/office/word/2024/wordml/sdtformatlock" xmlns:w16se="http://schemas.microsoft.com/office/word/2015/wordml/symex" xmlns:wpg="http://schemas.microsoft.com/office/word/2010/wordprocessingGroup" xmlns:wpi="http://schemas.microsoft.com/office/word/2010/wordprocessingInk" xmlns:wne="http://schemas.microsoft.com/office/word/2006/wordml" xmlns:wps="http://schemas.microsoft.com/office/word/2010/wordprocessingShape" mc:Ignorable="w14 w15 w16se w16cid w16 w16cex w16sdtdh w16sdtfl w16du wp14">
+  <w:abstractNum w:abstractNumId="0" w15:restartNumberingAfterBreak="0">
+    <w:nsid w:val="482273E0"/>
+    <w:multiLevelType w:val="hybridMultilevel"/>
+    <w:tmpl w:val="5F187236"/>
+    <w:lvl w:ilvl="0" w:tplc="04090001">
+      <w:start w:val="1"/>
+      <w:numFmt w:val="bullet"/>
+      <w:lvlText w:val=""/>
+      <w:lvlJc w:val="left"/>
+      <w:pPr>
+        <w:ind w:left="1440" w:hanging="360"/>
+      </w:pPr>
+      <w:rPr>
+        <w:rFonts w:ascii="Symbol" w:hAnsi="Symbol" w:hint="default"/>
+      </w:rPr>
+    </w:lvl>
+    <w:lvl w:ilvl="1" w:tplc="04090003" w:tentative="1">
+      <w:start w:val="1"/>
+      <w:numFmt w:val="bullet"/>
+      <w:lvlText w:val="o"/>
+      <w:lvlJc w:val="left"/>
+      <w:pPr>
+        <w:ind w:left="2160" w:hanging="360"/>
+      </w:pPr>
+      <w:rPr>
+        <w:rFonts w:ascii="Courier New" w:hAnsi="Courier New" w:cs="Courier New" w:hint="default"/>
+      </w:rPr>
+    </w:lvl>
+    <w:lvl w:ilvl="2" w:tplc="04090005" w:tentative="1">
+      <w:start w:val="1"/>
+      <w:numFmt w:val="bullet"/>
+      <w:lvlText w:val=""/>
+      <w:lvlJc w:val="left"/>
+      <w:pPr>
+        <w:ind w:left="2880" w:hanging="360"/>
+      </w:pPr>
+      <w:rPr>
+        <w:rFonts w:ascii="Wingdings" w:hAnsi="Wingdings" w:hint="default"/>
+      </w:rPr>
+    </w:lvl>
+    <w:lvl w:ilvl="3" w:tplc="04090001" w:tentative="1">
+      <w:start w:val="1"/>
+      <w:numFmt w:val="bullet"/>
+      <w:lvlText w:val=""/>
+      <w:lvlJc w:val="left"/>
+      <w:pPr>
+        <w:ind w:left="3600" w:hanging="360"/>
+      </w:pPr>
+      <w:rPr>
+        <w:rFonts w:ascii="Symbol" w:hAnsi="Symbol" w:hint="default"/>
+      </w:rPr>
+    </w:lvl>
+    <w:lvl w:ilvl="4" w:tplc="04090003" w:tentative="1">
+      <w:start w:val="1"/>
+      <w:numFmt w:val="bullet"/>
+      <w:lvlText w:val="o"/>
+      <w:lvlJc w:val="left"/>
+      <w:pPr>
+        <w:ind w:left="4320" w:hanging="360"/>
+      </w:pPr>
+      <w:rPr>
+        <w:rFonts w:ascii="Courier New" w:hAnsi="Courier New" w:cs="Courier New" w:hint="default"/>
+      </w:rPr>
+    </w:lvl>
+    <w:lvl w:ilvl="5" w:tplc="04090005" w:tentative="1">
+      <w:start w:val="1"/>
+      <w:numFmt w:val="bullet"/>
+      <w:lvlText w:val=""/>
+      <w:lvlJc w:val="left"/>
+      <w:pPr>
+        <w:ind w:left="5040" w:hanging="360"/>
+      </w:pPr>
+      <w:rPr>
+        <w:rFonts w:ascii="Wingdings" w:hAnsi="Wingdings" w:hint="default"/>
+      </w:rPr>
+    </w:lvl>
+    <w:lvl w:ilvl="6" w:tplc="04090001" w:tentative="1">
+      <w:start w:val="1"/>
+      <w:numFmt w:val="bullet"/>
+      <w:lvlText w:val=""/>
+      <w:lvlJc w:val="left"/>
+      <w:pPr>
+        <w:ind w:left="5760" w:hanging="360"/>
+      </w:pPr>
+      <w:rPr>
+        <w:rFonts w:ascii="Symbol" w:hAnsi="Symbol" w:hint="default"/>
+      </w:rPr>
+    </w:lvl>
+    <w:lvl w:ilvl="7" w:tplc="04090003" w:tentative="1">
+      <w:start w:val="1"/>
+      <w:numFmt w:val="bullet"/>
+      <w:lvlText w:val="o"/>
+      <w:lvlJc w:val="left"/>
+      <w:pPr>
+        <w:ind w:left="6480" w:hanging="360"/>
+      </w:pPr>
+      <w:rPr>
+        <w:rFonts w:ascii="Courier New" w:hAnsi="Courier New" w:cs="Courier New" w:hint="default"/>
+      </w:rPr>
+    </w:lvl>
+    <w:lvl w:ilvl="8" w:tplc="04090005" w:tentative="1">
+      <w:start w:val="1"/>
+      <w:numFmt w:val="bullet"/>
+      <w:lvlText w:val=""/>
+      <w:lvlJc w:val="left"/>
+      <w:pPr>
+        <w:ind w:left="7200" w:hanging="360"/>
+      </w:pPr>
+      <w:rPr>
+        <w:rFonts w:ascii="Wingdings" w:hAnsi="Wingdings" w:hint="default"/>
+      </w:rPr>
+    </w:lvl>
+  </w:abstractNum>
+  <w:abstractNum w:abstractNumId="1" w15:restartNumberingAfterBreak="0">
+    <w:nsid w:val="61500E8B"/>
+    <w:multiLevelType w:val="hybridMultilevel"/>
+    <w:tmpl w:val="5F386182"/>
+    <w:lvl w:ilvl="0" w:tplc="04090001">
+      <w:start w:val="1"/>
+      <w:numFmt w:val="bullet"/>
+      <w:lvlText w:val=""/>
+      <w:lvlJc w:val="left"/>
+      <w:pPr>
+        <w:ind w:left="1440" w:hanging="360"/>
+      </w:pPr>
+      <w:rPr>
+        <w:rFonts w:ascii="Symbol" w:hAnsi="Symbol" w:hint="default"/>
+      </w:rPr>
+    </w:lvl>
+    <w:lvl w:ilvl="1" w:tplc="04090003" w:tentative="1">
+      <w:start w:val="1"/>
+      <w:numFmt w:val="bullet"/>
+      <w:lvlText w:val="o"/>
+      <w:lvlJc w:val="left"/>
+      <w:pPr>
+        <w:ind w:left="2160" w:hanging="360"/>
+      </w:pPr>
+      <w:rPr>
+        <w:rFonts w:ascii="Courier New" w:hAnsi="Courier New" w:cs="Courier New" w:hint="default"/>
+      </w:rPr>
+    </w:lvl>
+    <w:lvl w:ilvl="2" w:tplc="04090005" w:tentative="1">
+      <w:start w:val="1"/>
+      <w:numFmt w:val="bullet"/>
+      <w:lvlText w:val=""/>
+      <w:lvlJc w:val="left"/>
+      <w:pPr>
+        <w:ind w:left="2880" w:hanging="360"/>
+      </w:pPr>
+      <w:rPr>
+        <w:rFonts w:ascii="Wingdings" w:hAnsi="Wingdings" w:hint="default"/>
+      </w:rPr>
+    </w:lvl>
+    <w:lvl w:ilvl="3" w:tplc="04090001" w:tentative="1">
+      <w:start w:val="1"/>
+      <w:numFmt w:val="bullet"/>
+      <w:lvlText w:val=""/>
+      <w:lvlJc w:val="left"/>
+      <w:pPr>
+        <w:ind w:left="3600" w:hanging="360"/>
+      </w:pPr>
+      <w:rPr>
+        <w:rFonts w:ascii="Symbol" w:hAnsi="Symbol" w:hint="default"/>
+      </w:rPr>
+    </w:lvl>
+    <w:lvl w:ilvl="4" w:tplc="04090003" w:tentative="1">
+      <w:start w:val="1"/>
+      <w:numFmt w:val="bullet"/>
+      <w:lvlText w:val="o"/>
+      <w:lvlJc w:val="left"/>
+      <w:pPr>
+        <w:ind w:left="4320" w:hanging="360"/>
+      </w:pPr>
+      <w:rPr>
+        <w:rFonts w:ascii="Courier New" w:hAnsi="Courier New" w:cs="Courier New" w:hint="default"/>
+      </w:rPr>
+    </w:lvl>
+    <w:lvl w:ilvl="5" w:tplc="04090005" w:tentative="1">
+      <w:start w:val="1"/>
+      <w:numFmt w:val="bullet"/>
+      <w:lvlText w:val=""/>
+      <w:lvlJc w:val="left"/>
+      <w:pPr>
+        <w:ind w:left="5040" w:hanging="360"/>
+      </w:pPr>
+      <w:rPr>
+        <w:rFonts w:ascii="Wingdings" w:hAnsi="Wingdings" w:hint="default"/>
+      </w:rPr>
+    </w:lvl>
+    <w:lvl w:ilvl="6" w:tplc="04090001" w:tentative="1">
+      <w:start w:val="1"/>
+      <w:numFmt w:val="bullet"/>
+      <w:lvlText w:val=""/>
+      <w:lvlJc w:val="left"/>
+      <w:pPr>
+        <w:ind w:left="5760" w:hanging="360"/>
+      </w:pPr>
+      <w:rPr>
+        <w:rFonts w:ascii="Symbol" w:hAnsi="Symbol" w:hint="default"/>
+      </w:rPr>
+    </w:lvl>
+    <w:lvl w:ilvl="7" w:tplc="04090003" w:tentative="1">
+      <w:start w:val="1"/>
+      <w:numFmt w:val="bullet"/>
+      <w:lvlText w:val="o"/>
+      <w:lvlJc w:val="left"/>
+      <w:pPr>
+        <w:ind w:left="6480" w:hanging="360"/>
+      </w:pPr>
+      <w:rPr>
+        <w:rFonts w:ascii="Courier New" w:hAnsi="Courier New" w:cs="Courier New" w:hint="default"/>
+      </w:rPr>
+    </w:lvl>
+    <w:lvl w:ilvl="8" w:tplc="04090005" w:tentative="1">
+      <w:start w:val="1"/>
+      <w:numFmt w:val="bullet"/>
+      <w:lvlText w:val=""/>
+      <w:lvlJc w:val="left"/>
+      <w:pPr>
+        <w:ind w:left="7200" w:hanging="360"/>
+      </w:pPr>
+      <w:rPr>
+        <w:rFonts w:ascii="Wingdings" w:hAnsi="Wingdings" w:hint="default"/>
+      </w:rPr>
+    </w:lvl>
+  </w:abstractNum>
+  <w:num w:numId="1" w16cid:durableId="1070925726">
+    <w:abstractNumId w:val="1"/>
+  </w:num>
+  <w:num w:numId="2" w16cid:durableId="291061205">
+    <w:abstractNumId w:val="0"/>
+  </w:num>
+</w:numbering>
 </file>
 
 <file path=word/styles.xml><?xml version="1.0" encoding="utf-8"?>

</xml_diff>